<commit_message>
Modificaciones menores al informe y armado del .rar final tp5
</commit_message>
<xml_diff>
--- a/TP5/informe/TP5 AN - Acosta, Bleuel, Bude, Dellacqua.docx
+++ b/TP5/informe/TP5 AN - Acosta, Bleuel, Bude, Dellacqua.docx
@@ -1,6 +1,6 @@
 
 <file path=word/document.xml><?xml version="1.0" encoding="utf-8"?>
-<w:document xmlns:wpc="http://schemas.microsoft.com/office/word/2010/wordprocessingCanvas" xmlns:cx="http://schemas.microsoft.com/office/drawing/2014/chartex" xmlns:cx1="http://schemas.microsoft.com/office/drawing/2015/9/8/chartex" xmlns:cx2="http://schemas.microsoft.com/office/drawing/2015/10/21/chartex" xmlns:cx3="http://schemas.microsoft.com/office/drawing/2016/5/9/chartex" xmlns:cx4="http://schemas.microsoft.com/office/drawing/2016/5/10/chartex" xmlns:cx5="http://schemas.microsoft.com/office/drawing/2016/5/11/chartex" xmlns:cx6="http://schemas.microsoft.com/office/drawing/2016/5/12/chartex" xmlns:cx7="http://schemas.microsoft.com/office/drawing/2016/5/13/chartex" xmlns:cx8="http://schemas.microsoft.com/office/drawing/2016/5/14/chartex" xmlns:mc="http://schemas.openxmlformats.org/markup-compatibility/2006" xmlns:aink="http://schemas.microsoft.com/office/drawing/2016/ink" xmlns:am3d="http://schemas.microsoft.com/office/drawing/2017/model3d" xmlns:o="urn:schemas-microsoft-com:office:office" xmlns:oel="http://schemas.microsoft.com/office/2019/extlst" xmlns:r="http://schemas.openxmlformats.org/officeDocument/2006/relationships" xmlns:m="http://schemas.openxmlformats.org/officeDocument/2006/math" xmlns:v="urn:schemas-microsoft-com:vml" xmlns:wp14="http://schemas.microsoft.com/office/word/2010/wordprocessingDrawing" xmlns:wp="http://schemas.openxmlformats.org/drawingml/2006/wordprocessingDrawing" xmlns:w10="urn:schemas-microsoft-com:office:word" xmlns:w="http://schemas.openxmlformats.org/wordprocessingml/2006/main" xmlns:w14="http://schemas.microsoft.com/office/word/2010/wordml" xmlns:w15="http://schemas.microsoft.com/office/word/2012/wordml" xmlns:w16cex="http://schemas.microsoft.com/office/word/2018/wordml/cex" xmlns:w16cid="http://schemas.microsoft.com/office/word/2016/wordml/cid" xmlns:w16="http://schemas.microsoft.com/office/word/2018/wordml" xmlns:w16du="http://schemas.microsoft.com/office/word/2023/wordml/word16du" xmlns:w16sdtdh="http://schemas.microsoft.com/office/word/2020/wordml/sdtdatahash" xmlns:w16sdtfl="http://schemas.microsoft.com/office/word/2024/wordml/sdtformatlock" xmlns:w16se="http://schemas.microsoft.com/office/word/2015/wordml/symex" xmlns:wpg="http://schemas.microsoft.com/office/word/2010/wordprocessingGroup" xmlns:wpi="http://schemas.microsoft.com/office/word/2010/wordprocessingInk" xmlns:wne="http://schemas.microsoft.com/office/word/2006/wordml" xmlns:wps="http://schemas.microsoft.com/office/word/2010/wordprocessingShape" mc:Ignorable="w14 w15 w16se w16cid w16 w16cex w16sdtdh w16sdtfl w16du wp14">
+<w:document xmlns:wpc="http://schemas.microsoft.com/office/word/2010/wordprocessingCanvas" xmlns:cx="http://schemas.microsoft.com/office/drawing/2014/chartex" xmlns:mc="http://schemas.openxmlformats.org/markup-compatibility/2006" xmlns:o="urn:schemas-microsoft-com:office:office" xmlns:r="http://schemas.openxmlformats.org/officeDocument/2006/relationships" xmlns:m="http://schemas.openxmlformats.org/officeDocument/2006/math" xmlns:v="urn:schemas-microsoft-com:vml" xmlns:wp14="http://schemas.microsoft.com/office/word/2010/wordprocessingDrawing" xmlns:wp="http://schemas.openxmlformats.org/drawingml/2006/wordprocessingDrawing" xmlns:w10="urn:schemas-microsoft-com:office:word" xmlns:w="http://schemas.openxmlformats.org/wordprocessingml/2006/main" xmlns:w14="http://schemas.microsoft.com/office/word/2010/wordml" xmlns:w15="http://schemas.microsoft.com/office/word/2012/wordml" xmlns:w16se="http://schemas.microsoft.com/office/word/2015/wordml/symex" xmlns:wpg="http://schemas.microsoft.com/office/word/2010/wordprocessingGroup" xmlns:wpi="http://schemas.microsoft.com/office/word/2010/wordprocessingInk" xmlns:wne="http://schemas.microsoft.com/office/word/2006/wordml" xmlns:wps="http://schemas.microsoft.com/office/word/2010/wordprocessingShape" mc:Ignorable="w14 w15 w16se wp14">
   <w:body>
     <w:p>
       <w:pPr>
@@ -21,6 +21,7 @@
         <w:rPr>
           <w:rFonts w:ascii="Times New Roman" w:hAnsi="Times New Roman" w:cs="Times New Roman"/>
           <w:noProof/>
+          <w:lang w:eastAsia="es-AR"/>
         </w:rPr>
         <w:drawing>
           <wp:inline distT="0" distB="0" distL="0" distR="0" wp14:anchorId="2919DD7D" wp14:editId="1D96EAE9">
@@ -40,7 +41,7 @@
                     </pic:cNvPicPr>
                   </pic:nvPicPr>
                   <pic:blipFill rotWithShape="1">
-                    <a:blip r:embed="rId5">
+                    <a:blip r:embed="rId6">
                       <a:extLst>
                         <a:ext uri="{28A0092B-C50C-407E-A947-70E740481C1C}">
                           <a14:useLocalDpi xmlns:a14="http://schemas.microsoft.com/office/drawing/2010/main" val="0"/>
@@ -302,9 +303,1457 @@
         <w:t>PABLO DELLACQUA</w:t>
       </w:r>
     </w:p>
-    <w:p>
-      <w:pPr>
-        <w:jc w:val="center"/>
+    <w:sdt>
+      <w:sdtPr>
+        <w:rPr>
+          <w:lang w:val="es-ES"/>
+        </w:rPr>
+        <w:id w:val="1412353659"/>
+        <w:docPartObj>
+          <w:docPartGallery w:val="Table of Contents"/>
+          <w:docPartUnique/>
+        </w:docPartObj>
+      </w:sdtPr>
+      <w:sdtEndPr>
+        <w:rPr>
+          <w:rFonts w:asciiTheme="minorHAnsi" w:eastAsiaTheme="minorHAnsi" w:hAnsiTheme="minorHAnsi" w:cstheme="minorBidi"/>
+          <w:b/>
+          <w:bCs/>
+          <w:color w:val="auto"/>
+          <w:kern w:val="2"/>
+          <w:sz w:val="24"/>
+          <w:szCs w:val="24"/>
+          <w:lang w:eastAsia="en-US"/>
+          <w14:ligatures w14:val="standardContextual"/>
+        </w:rPr>
+      </w:sdtEndPr>
+      <w:sdtContent>
+        <w:p>
+          <w:pPr>
+            <w:pStyle w:val="TtuloTDC"/>
+          </w:pPr>
+          <w:r>
+            <w:rPr>
+              <w:lang w:val="es-ES"/>
+            </w:rPr>
+            <w:t>Traba</w:t>
+          </w:r>
+          <w:bookmarkStart w:id="0" w:name="_GoBack"/>
+          <w:bookmarkEnd w:id="0"/>
+          <w:r>
+            <w:rPr>
+              <w:lang w:val="es-ES"/>
+            </w:rPr>
+            <w:t>jo práctico 5</w:t>
+          </w:r>
+        </w:p>
+        <w:p>
+          <w:pPr>
+            <w:pStyle w:val="TDC1"/>
+            <w:tabs>
+              <w:tab w:val="right" w:leader="dot" w:pos="8494"/>
+            </w:tabs>
+            <w:rPr>
+              <w:rFonts w:eastAsiaTheme="minorEastAsia"/>
+              <w:noProof/>
+              <w:kern w:val="0"/>
+              <w:sz w:val="22"/>
+              <w:szCs w:val="22"/>
+              <w:lang w:eastAsia="es-AR"/>
+              <w14:ligatures w14:val="none"/>
+            </w:rPr>
+          </w:pPr>
+          <w:r>
+            <w:fldChar w:fldCharType="begin"/>
+          </w:r>
+          <w:r>
+            <w:instrText xml:space="preserve"> TOC \o "1-3" \h \z \u </w:instrText>
+          </w:r>
+          <w:r>
+            <w:fldChar w:fldCharType="separate"/>
+          </w:r>
+          <w:hyperlink w:anchor="_Toc243574082" w:history="1">
+            <w:r>
+              <w:rPr>
+                <w:rStyle w:val="Hipervnculo"/>
+                <w:rFonts w:ascii="Times New Roman" w:hAnsi="Times New Roman" w:cs="Times New Roman"/>
+                <w:b/>
+                <w:bCs/>
+                <w:noProof/>
+              </w:rPr>
+              <w:t>Introducción:</w:t>
+            </w:r>
+            <w:r>
+              <w:rPr>
+                <w:noProof/>
+                <w:webHidden/>
+              </w:rPr>
+              <w:tab/>
+            </w:r>
+            <w:r>
+              <w:rPr>
+                <w:noProof/>
+                <w:webHidden/>
+              </w:rPr>
+              <w:fldChar w:fldCharType="begin"/>
+            </w:r>
+            <w:r>
+              <w:rPr>
+                <w:noProof/>
+                <w:webHidden/>
+              </w:rPr>
+              <w:instrText xml:space="preserve"> PAGEREF _Toc243574082 \h </w:instrText>
+            </w:r>
+            <w:r>
+              <w:rPr>
+                <w:noProof/>
+                <w:webHidden/>
+              </w:rPr>
+            </w:r>
+            <w:r>
+              <w:rPr>
+                <w:noProof/>
+                <w:webHidden/>
+              </w:rPr>
+              <w:fldChar w:fldCharType="separate"/>
+            </w:r>
+            <w:r>
+              <w:rPr>
+                <w:noProof/>
+                <w:webHidden/>
+              </w:rPr>
+              <w:t>3</w:t>
+            </w:r>
+            <w:r>
+              <w:rPr>
+                <w:noProof/>
+                <w:webHidden/>
+              </w:rPr>
+              <w:fldChar w:fldCharType="end"/>
+            </w:r>
+          </w:hyperlink>
+        </w:p>
+        <w:p>
+          <w:pPr>
+            <w:pStyle w:val="TDC1"/>
+            <w:tabs>
+              <w:tab w:val="right" w:leader="dot" w:pos="8494"/>
+            </w:tabs>
+            <w:rPr>
+              <w:rFonts w:eastAsiaTheme="minorEastAsia"/>
+              <w:noProof/>
+              <w:kern w:val="0"/>
+              <w:sz w:val="22"/>
+              <w:szCs w:val="22"/>
+              <w:lang w:eastAsia="es-AR"/>
+              <w14:ligatures w14:val="none"/>
+            </w:rPr>
+          </w:pPr>
+          <w:hyperlink w:anchor="_Toc243574083" w:history="1">
+            <w:r>
+              <w:rPr>
+                <w:rStyle w:val="Hipervnculo"/>
+                <w:rFonts w:ascii="Times New Roman" w:hAnsi="Times New Roman" w:cs="Times New Roman"/>
+                <w:b/>
+                <w:bCs/>
+                <w:noProof/>
+              </w:rPr>
+              <w:t>1. Superficie de los techos</w:t>
+            </w:r>
+            <w:r>
+              <w:rPr>
+                <w:noProof/>
+                <w:webHidden/>
+              </w:rPr>
+              <w:tab/>
+            </w:r>
+            <w:r>
+              <w:rPr>
+                <w:noProof/>
+                <w:webHidden/>
+              </w:rPr>
+              <w:fldChar w:fldCharType="begin"/>
+            </w:r>
+            <w:r>
+              <w:rPr>
+                <w:noProof/>
+                <w:webHidden/>
+              </w:rPr>
+              <w:instrText xml:space="preserve"> PAGEREF _Toc243574083 \h </w:instrText>
+            </w:r>
+            <w:r>
+              <w:rPr>
+                <w:noProof/>
+                <w:webHidden/>
+              </w:rPr>
+            </w:r>
+            <w:r>
+              <w:rPr>
+                <w:noProof/>
+                <w:webHidden/>
+              </w:rPr>
+              <w:fldChar w:fldCharType="separate"/>
+            </w:r>
+            <w:r>
+              <w:rPr>
+                <w:noProof/>
+                <w:webHidden/>
+              </w:rPr>
+              <w:t>3</w:t>
+            </w:r>
+            <w:r>
+              <w:rPr>
+                <w:noProof/>
+                <w:webHidden/>
+              </w:rPr>
+              <w:fldChar w:fldCharType="end"/>
+            </w:r>
+          </w:hyperlink>
+        </w:p>
+        <w:p>
+          <w:pPr>
+            <w:pStyle w:val="TDC2"/>
+            <w:tabs>
+              <w:tab w:val="right" w:leader="dot" w:pos="8494"/>
+            </w:tabs>
+            <w:rPr>
+              <w:rFonts w:eastAsiaTheme="minorEastAsia"/>
+              <w:noProof/>
+              <w:kern w:val="0"/>
+              <w:sz w:val="22"/>
+              <w:szCs w:val="22"/>
+              <w:lang w:eastAsia="es-AR"/>
+              <w14:ligatures w14:val="none"/>
+            </w:rPr>
+          </w:pPr>
+          <w:hyperlink w:anchor="_Toc243574084" w:history="1">
+            <w:r>
+              <w:rPr>
+                <w:rStyle w:val="Hipervnculo"/>
+                <w:rFonts w:ascii="Times New Roman" w:hAnsi="Times New Roman" w:cs="Times New Roman"/>
+                <w:iCs/>
+                <w:noProof/>
+              </w:rPr>
+              <w:t>Justificación del método seleccionado</w:t>
+            </w:r>
+            <w:r>
+              <w:rPr>
+                <w:noProof/>
+                <w:webHidden/>
+              </w:rPr>
+              <w:tab/>
+            </w:r>
+            <w:r>
+              <w:rPr>
+                <w:noProof/>
+                <w:webHidden/>
+              </w:rPr>
+              <w:fldChar w:fldCharType="begin"/>
+            </w:r>
+            <w:r>
+              <w:rPr>
+                <w:noProof/>
+                <w:webHidden/>
+              </w:rPr>
+              <w:instrText xml:space="preserve"> PAGEREF _Toc243574084 \h </w:instrText>
+            </w:r>
+            <w:r>
+              <w:rPr>
+                <w:noProof/>
+                <w:webHidden/>
+              </w:rPr>
+            </w:r>
+            <w:r>
+              <w:rPr>
+                <w:noProof/>
+                <w:webHidden/>
+              </w:rPr>
+              <w:fldChar w:fldCharType="separate"/>
+            </w:r>
+            <w:r>
+              <w:rPr>
+                <w:noProof/>
+                <w:webHidden/>
+              </w:rPr>
+              <w:t>3</w:t>
+            </w:r>
+            <w:r>
+              <w:rPr>
+                <w:noProof/>
+                <w:webHidden/>
+              </w:rPr>
+              <w:fldChar w:fldCharType="end"/>
+            </w:r>
+          </w:hyperlink>
+        </w:p>
+        <w:p>
+          <w:pPr>
+            <w:pStyle w:val="TDC2"/>
+            <w:tabs>
+              <w:tab w:val="right" w:leader="dot" w:pos="8494"/>
+            </w:tabs>
+            <w:rPr>
+              <w:rFonts w:eastAsiaTheme="minorEastAsia"/>
+              <w:noProof/>
+              <w:kern w:val="0"/>
+              <w:sz w:val="22"/>
+              <w:szCs w:val="22"/>
+              <w:lang w:eastAsia="es-AR"/>
+              <w14:ligatures w14:val="none"/>
+            </w:rPr>
+          </w:pPr>
+          <w:hyperlink w:anchor="_Toc243574085" w:history="1">
+            <w:r>
+              <w:rPr>
+                <w:rStyle w:val="Hipervnculo"/>
+                <w:rFonts w:ascii="Times New Roman" w:hAnsi="Times New Roman" w:cs="Times New Roman"/>
+                <w:iCs/>
+                <w:noProof/>
+              </w:rPr>
+              <w:t>Cálculo y conversión de escala</w:t>
+            </w:r>
+            <w:r>
+              <w:rPr>
+                <w:noProof/>
+                <w:webHidden/>
+              </w:rPr>
+              <w:tab/>
+            </w:r>
+            <w:r>
+              <w:rPr>
+                <w:noProof/>
+                <w:webHidden/>
+              </w:rPr>
+              <w:fldChar w:fldCharType="begin"/>
+            </w:r>
+            <w:r>
+              <w:rPr>
+                <w:noProof/>
+                <w:webHidden/>
+              </w:rPr>
+              <w:instrText xml:space="preserve"> PAGEREF _Toc243574085 \h </w:instrText>
+            </w:r>
+            <w:r>
+              <w:rPr>
+                <w:noProof/>
+                <w:webHidden/>
+              </w:rPr>
+            </w:r>
+            <w:r>
+              <w:rPr>
+                <w:noProof/>
+                <w:webHidden/>
+              </w:rPr>
+              <w:fldChar w:fldCharType="separate"/>
+            </w:r>
+            <w:r>
+              <w:rPr>
+                <w:noProof/>
+                <w:webHidden/>
+              </w:rPr>
+              <w:t>3</w:t>
+            </w:r>
+            <w:r>
+              <w:rPr>
+                <w:noProof/>
+                <w:webHidden/>
+              </w:rPr>
+              <w:fldChar w:fldCharType="end"/>
+            </w:r>
+          </w:hyperlink>
+        </w:p>
+        <w:p>
+          <w:pPr>
+            <w:pStyle w:val="TDC2"/>
+            <w:tabs>
+              <w:tab w:val="right" w:leader="dot" w:pos="8494"/>
+            </w:tabs>
+            <w:rPr>
+              <w:rFonts w:eastAsiaTheme="minorEastAsia"/>
+              <w:noProof/>
+              <w:kern w:val="0"/>
+              <w:sz w:val="22"/>
+              <w:szCs w:val="22"/>
+              <w:lang w:eastAsia="es-AR"/>
+              <w14:ligatures w14:val="none"/>
+            </w:rPr>
+          </w:pPr>
+          <w:hyperlink w:anchor="_Toc243574086" w:history="1">
+            <w:r>
+              <w:rPr>
+                <w:rStyle w:val="Hipervnculo"/>
+                <w:rFonts w:ascii="Times New Roman" w:hAnsi="Times New Roman" w:cs="Times New Roman"/>
+                <w:iCs/>
+                <w:noProof/>
+              </w:rPr>
+              <w:t>Análisis de errores geométricos</w:t>
+            </w:r>
+            <w:r>
+              <w:rPr>
+                <w:noProof/>
+                <w:webHidden/>
+              </w:rPr>
+              <w:tab/>
+            </w:r>
+            <w:r>
+              <w:rPr>
+                <w:noProof/>
+                <w:webHidden/>
+              </w:rPr>
+              <w:fldChar w:fldCharType="begin"/>
+            </w:r>
+            <w:r>
+              <w:rPr>
+                <w:noProof/>
+                <w:webHidden/>
+              </w:rPr>
+              <w:instrText xml:space="preserve"> PAGEREF _Toc243574086 \h </w:instrText>
+            </w:r>
+            <w:r>
+              <w:rPr>
+                <w:noProof/>
+                <w:webHidden/>
+              </w:rPr>
+            </w:r>
+            <w:r>
+              <w:rPr>
+                <w:noProof/>
+                <w:webHidden/>
+              </w:rPr>
+              <w:fldChar w:fldCharType="separate"/>
+            </w:r>
+            <w:r>
+              <w:rPr>
+                <w:noProof/>
+                <w:webHidden/>
+              </w:rPr>
+              <w:t>4</w:t>
+            </w:r>
+            <w:r>
+              <w:rPr>
+                <w:noProof/>
+                <w:webHidden/>
+              </w:rPr>
+              <w:fldChar w:fldCharType="end"/>
+            </w:r>
+          </w:hyperlink>
+        </w:p>
+        <w:p>
+          <w:pPr>
+            <w:pStyle w:val="TDC1"/>
+            <w:tabs>
+              <w:tab w:val="right" w:leader="dot" w:pos="8494"/>
+            </w:tabs>
+            <w:rPr>
+              <w:rFonts w:eastAsiaTheme="minorEastAsia"/>
+              <w:noProof/>
+              <w:kern w:val="0"/>
+              <w:sz w:val="22"/>
+              <w:szCs w:val="22"/>
+              <w:lang w:eastAsia="es-AR"/>
+              <w14:ligatures w14:val="none"/>
+            </w:rPr>
+          </w:pPr>
+          <w:hyperlink w:anchor="_Toc243574087" w:history="1">
+            <w:r>
+              <w:rPr>
+                <w:rStyle w:val="Hipervnculo"/>
+                <w:rFonts w:ascii="Times New Roman" w:hAnsi="Times New Roman" w:cs="Times New Roman"/>
+                <w:b/>
+                <w:bCs/>
+                <w:noProof/>
+              </w:rPr>
+              <w:t>2. Radiación Solar y Análisis de Error</w:t>
+            </w:r>
+            <w:r>
+              <w:rPr>
+                <w:noProof/>
+                <w:webHidden/>
+              </w:rPr>
+              <w:tab/>
+            </w:r>
+            <w:r>
+              <w:rPr>
+                <w:noProof/>
+                <w:webHidden/>
+              </w:rPr>
+              <w:fldChar w:fldCharType="begin"/>
+            </w:r>
+            <w:r>
+              <w:rPr>
+                <w:noProof/>
+                <w:webHidden/>
+              </w:rPr>
+              <w:instrText xml:space="preserve"> PAGEREF _Toc243574087 \h </w:instrText>
+            </w:r>
+            <w:r>
+              <w:rPr>
+                <w:noProof/>
+                <w:webHidden/>
+              </w:rPr>
+            </w:r>
+            <w:r>
+              <w:rPr>
+                <w:noProof/>
+                <w:webHidden/>
+              </w:rPr>
+              <w:fldChar w:fldCharType="separate"/>
+            </w:r>
+            <w:r>
+              <w:rPr>
+                <w:noProof/>
+                <w:webHidden/>
+              </w:rPr>
+              <w:t>4</w:t>
+            </w:r>
+            <w:r>
+              <w:rPr>
+                <w:noProof/>
+                <w:webHidden/>
+              </w:rPr>
+              <w:fldChar w:fldCharType="end"/>
+            </w:r>
+          </w:hyperlink>
+        </w:p>
+        <w:p>
+          <w:pPr>
+            <w:pStyle w:val="TDC2"/>
+            <w:tabs>
+              <w:tab w:val="right" w:leader="dot" w:pos="8494"/>
+            </w:tabs>
+            <w:rPr>
+              <w:rFonts w:eastAsiaTheme="minorEastAsia"/>
+              <w:noProof/>
+              <w:kern w:val="0"/>
+              <w:sz w:val="22"/>
+              <w:szCs w:val="22"/>
+              <w:lang w:eastAsia="es-AR"/>
+              <w14:ligatures w14:val="none"/>
+            </w:rPr>
+          </w:pPr>
+          <w:hyperlink w:anchor="_Toc243574088" w:history="1">
+            <w:r>
+              <w:rPr>
+                <w:rStyle w:val="Hipervnculo"/>
+                <w:rFonts w:ascii="Times New Roman" w:hAnsi="Times New Roman" w:cs="Times New Roman"/>
+                <w:iCs/>
+                <w:noProof/>
+              </w:rPr>
+              <w:t>Cálculo de la Irradiancia Diaria Acumulada</w:t>
+            </w:r>
+            <w:r>
+              <w:rPr>
+                <w:noProof/>
+                <w:webHidden/>
+              </w:rPr>
+              <w:tab/>
+            </w:r>
+            <w:r>
+              <w:rPr>
+                <w:noProof/>
+                <w:webHidden/>
+              </w:rPr>
+              <w:fldChar w:fldCharType="begin"/>
+            </w:r>
+            <w:r>
+              <w:rPr>
+                <w:noProof/>
+                <w:webHidden/>
+              </w:rPr>
+              <w:instrText xml:space="preserve"> PAGEREF _Toc243574088 \h </w:instrText>
+            </w:r>
+            <w:r>
+              <w:rPr>
+                <w:noProof/>
+                <w:webHidden/>
+              </w:rPr>
+            </w:r>
+            <w:r>
+              <w:rPr>
+                <w:noProof/>
+                <w:webHidden/>
+              </w:rPr>
+              <w:fldChar w:fldCharType="separate"/>
+            </w:r>
+            <w:r>
+              <w:rPr>
+                <w:noProof/>
+                <w:webHidden/>
+              </w:rPr>
+              <w:t>4</w:t>
+            </w:r>
+            <w:r>
+              <w:rPr>
+                <w:noProof/>
+                <w:webHidden/>
+              </w:rPr>
+              <w:fldChar w:fldCharType="end"/>
+            </w:r>
+          </w:hyperlink>
+        </w:p>
+        <w:p>
+          <w:pPr>
+            <w:pStyle w:val="TDC2"/>
+            <w:tabs>
+              <w:tab w:val="right" w:leader="dot" w:pos="8494"/>
+            </w:tabs>
+            <w:rPr>
+              <w:rFonts w:eastAsiaTheme="minorEastAsia"/>
+              <w:noProof/>
+              <w:kern w:val="0"/>
+              <w:sz w:val="22"/>
+              <w:szCs w:val="22"/>
+              <w:lang w:eastAsia="es-AR"/>
+              <w14:ligatures w14:val="none"/>
+            </w:rPr>
+          </w:pPr>
+          <w:hyperlink w:anchor="_Toc243574089" w:history="1">
+            <w:r>
+              <w:rPr>
+                <w:rStyle w:val="Hipervnculo"/>
+                <w:rFonts w:ascii="Times New Roman" w:hAnsi="Times New Roman" w:cs="Times New Roman"/>
+                <w:iCs/>
+                <w:noProof/>
+              </w:rPr>
+              <w:t>Estimación Empírica del Error de Truncamiento</w:t>
+            </w:r>
+            <w:r>
+              <w:rPr>
+                <w:noProof/>
+                <w:webHidden/>
+              </w:rPr>
+              <w:tab/>
+            </w:r>
+            <w:r>
+              <w:rPr>
+                <w:noProof/>
+                <w:webHidden/>
+              </w:rPr>
+              <w:fldChar w:fldCharType="begin"/>
+            </w:r>
+            <w:r>
+              <w:rPr>
+                <w:noProof/>
+                <w:webHidden/>
+              </w:rPr>
+              <w:instrText xml:space="preserve"> PAGEREF _Toc243574089 \h </w:instrText>
+            </w:r>
+            <w:r>
+              <w:rPr>
+                <w:noProof/>
+                <w:webHidden/>
+              </w:rPr>
+            </w:r>
+            <w:r>
+              <w:rPr>
+                <w:noProof/>
+                <w:webHidden/>
+              </w:rPr>
+              <w:fldChar w:fldCharType="separate"/>
+            </w:r>
+            <w:r>
+              <w:rPr>
+                <w:noProof/>
+                <w:webHidden/>
+              </w:rPr>
+              <w:t>5</w:t>
+            </w:r>
+            <w:r>
+              <w:rPr>
+                <w:noProof/>
+                <w:webHidden/>
+              </w:rPr>
+              <w:fldChar w:fldCharType="end"/>
+            </w:r>
+          </w:hyperlink>
+        </w:p>
+        <w:p>
+          <w:pPr>
+            <w:pStyle w:val="TDC2"/>
+            <w:tabs>
+              <w:tab w:val="right" w:leader="dot" w:pos="8494"/>
+            </w:tabs>
+            <w:rPr>
+              <w:rFonts w:eastAsiaTheme="minorEastAsia"/>
+              <w:noProof/>
+              <w:kern w:val="0"/>
+              <w:sz w:val="22"/>
+              <w:szCs w:val="22"/>
+              <w:lang w:eastAsia="es-AR"/>
+              <w14:ligatures w14:val="none"/>
+            </w:rPr>
+          </w:pPr>
+          <w:hyperlink w:anchor="_Toc243574090" w:history="1">
+            <w:r>
+              <w:rPr>
+                <w:rStyle w:val="Hipervnculo"/>
+                <w:rFonts w:ascii="Times New Roman" w:eastAsia="Times New Roman" w:hAnsi="Times New Roman" w:cs="Times New Roman"/>
+                <w:iCs/>
+                <w:noProof/>
+                <w:lang w:eastAsia="es-AR"/>
+              </w:rPr>
+              <w:t>Impacto de la Nubosidad y Submuestreo Espacial</w:t>
+            </w:r>
+            <w:r>
+              <w:rPr>
+                <w:noProof/>
+                <w:webHidden/>
+              </w:rPr>
+              <w:tab/>
+            </w:r>
+            <w:r>
+              <w:rPr>
+                <w:noProof/>
+                <w:webHidden/>
+              </w:rPr>
+              <w:fldChar w:fldCharType="begin"/>
+            </w:r>
+            <w:r>
+              <w:rPr>
+                <w:noProof/>
+                <w:webHidden/>
+              </w:rPr>
+              <w:instrText xml:space="preserve"> PAGEREF _Toc243574090 \h </w:instrText>
+            </w:r>
+            <w:r>
+              <w:rPr>
+                <w:noProof/>
+                <w:webHidden/>
+              </w:rPr>
+            </w:r>
+            <w:r>
+              <w:rPr>
+                <w:noProof/>
+                <w:webHidden/>
+              </w:rPr>
+              <w:fldChar w:fldCharType="separate"/>
+            </w:r>
+            <w:r>
+              <w:rPr>
+                <w:noProof/>
+                <w:webHidden/>
+              </w:rPr>
+              <w:t>5</w:t>
+            </w:r>
+            <w:r>
+              <w:rPr>
+                <w:noProof/>
+                <w:webHidden/>
+              </w:rPr>
+              <w:fldChar w:fldCharType="end"/>
+            </w:r>
+          </w:hyperlink>
+        </w:p>
+        <w:p>
+          <w:pPr>
+            <w:pStyle w:val="TDC1"/>
+            <w:tabs>
+              <w:tab w:val="right" w:leader="dot" w:pos="8494"/>
+            </w:tabs>
+            <w:rPr>
+              <w:rFonts w:eastAsiaTheme="minorEastAsia"/>
+              <w:noProof/>
+              <w:kern w:val="0"/>
+              <w:sz w:val="22"/>
+              <w:szCs w:val="22"/>
+              <w:lang w:eastAsia="es-AR"/>
+              <w14:ligatures w14:val="none"/>
+            </w:rPr>
+          </w:pPr>
+          <w:hyperlink w:anchor="_Toc243574091" w:history="1">
+            <w:r>
+              <w:rPr>
+                <w:rStyle w:val="Hipervnculo"/>
+                <w:rFonts w:ascii="Times New Roman" w:eastAsia="Times New Roman" w:hAnsi="Times New Roman" w:cs="Times New Roman"/>
+                <w:b/>
+                <w:bCs/>
+                <w:noProof/>
+                <w:lang w:eastAsia="es-AR"/>
+              </w:rPr>
+              <w:t>3. Generación Fotovoltaica</w:t>
+            </w:r>
+            <w:r>
+              <w:rPr>
+                <w:noProof/>
+                <w:webHidden/>
+              </w:rPr>
+              <w:tab/>
+            </w:r>
+            <w:r>
+              <w:rPr>
+                <w:noProof/>
+                <w:webHidden/>
+              </w:rPr>
+              <w:fldChar w:fldCharType="begin"/>
+            </w:r>
+            <w:r>
+              <w:rPr>
+                <w:noProof/>
+                <w:webHidden/>
+              </w:rPr>
+              <w:instrText xml:space="preserve"> PAGEREF _Toc243574091 \h </w:instrText>
+            </w:r>
+            <w:r>
+              <w:rPr>
+                <w:noProof/>
+                <w:webHidden/>
+              </w:rPr>
+            </w:r>
+            <w:r>
+              <w:rPr>
+                <w:noProof/>
+                <w:webHidden/>
+              </w:rPr>
+              <w:fldChar w:fldCharType="separate"/>
+            </w:r>
+            <w:r>
+              <w:rPr>
+                <w:noProof/>
+                <w:webHidden/>
+              </w:rPr>
+              <w:t>6</w:t>
+            </w:r>
+            <w:r>
+              <w:rPr>
+                <w:noProof/>
+                <w:webHidden/>
+              </w:rPr>
+              <w:fldChar w:fldCharType="end"/>
+            </w:r>
+          </w:hyperlink>
+        </w:p>
+        <w:p>
+          <w:pPr>
+            <w:pStyle w:val="TDC2"/>
+            <w:tabs>
+              <w:tab w:val="right" w:leader="dot" w:pos="8494"/>
+            </w:tabs>
+            <w:rPr>
+              <w:rFonts w:eastAsiaTheme="minorEastAsia"/>
+              <w:noProof/>
+              <w:kern w:val="0"/>
+              <w:sz w:val="22"/>
+              <w:szCs w:val="22"/>
+              <w:lang w:eastAsia="es-AR"/>
+              <w14:ligatures w14:val="none"/>
+            </w:rPr>
+          </w:pPr>
+          <w:hyperlink w:anchor="_Toc243574092" w:history="1">
+            <w:r>
+              <w:rPr>
+                <w:rStyle w:val="Hipervnculo"/>
+                <w:rFonts w:ascii="Times New Roman" w:eastAsia="Times New Roman" w:hAnsi="Times New Roman" w:cs="Times New Roman"/>
+                <w:iCs/>
+                <w:noProof/>
+                <w:lang w:eastAsia="es-AR"/>
+              </w:rPr>
+              <w:t>Dimensionamiento del Parque Solar</w:t>
+            </w:r>
+            <w:r>
+              <w:rPr>
+                <w:noProof/>
+                <w:webHidden/>
+              </w:rPr>
+              <w:tab/>
+            </w:r>
+            <w:r>
+              <w:rPr>
+                <w:noProof/>
+                <w:webHidden/>
+              </w:rPr>
+              <w:fldChar w:fldCharType="begin"/>
+            </w:r>
+            <w:r>
+              <w:rPr>
+                <w:noProof/>
+                <w:webHidden/>
+              </w:rPr>
+              <w:instrText xml:space="preserve"> PAGEREF _Toc243574092 \h </w:instrText>
+            </w:r>
+            <w:r>
+              <w:rPr>
+                <w:noProof/>
+                <w:webHidden/>
+              </w:rPr>
+            </w:r>
+            <w:r>
+              <w:rPr>
+                <w:noProof/>
+                <w:webHidden/>
+              </w:rPr>
+              <w:fldChar w:fldCharType="separate"/>
+            </w:r>
+            <w:r>
+              <w:rPr>
+                <w:noProof/>
+                <w:webHidden/>
+              </w:rPr>
+              <w:t>6</w:t>
+            </w:r>
+            <w:r>
+              <w:rPr>
+                <w:noProof/>
+                <w:webHidden/>
+              </w:rPr>
+              <w:fldChar w:fldCharType="end"/>
+            </w:r>
+          </w:hyperlink>
+        </w:p>
+        <w:p>
+          <w:pPr>
+            <w:pStyle w:val="TDC2"/>
+            <w:tabs>
+              <w:tab w:val="right" w:leader="dot" w:pos="8494"/>
+            </w:tabs>
+            <w:rPr>
+              <w:rFonts w:eastAsiaTheme="minorEastAsia"/>
+              <w:noProof/>
+              <w:kern w:val="0"/>
+              <w:sz w:val="22"/>
+              <w:szCs w:val="22"/>
+              <w:lang w:eastAsia="es-AR"/>
+              <w14:ligatures w14:val="none"/>
+            </w:rPr>
+          </w:pPr>
+          <w:hyperlink w:anchor="_Toc243574093" w:history="1">
+            <w:r>
+              <w:rPr>
+                <w:rStyle w:val="Hipervnculo"/>
+                <w:rFonts w:ascii="Times New Roman" w:eastAsia="Times New Roman" w:hAnsi="Times New Roman" w:cs="Times New Roman"/>
+                <w:iCs/>
+                <w:noProof/>
+                <w:lang w:eastAsia="es-AR"/>
+              </w:rPr>
+              <w:t>Integración de la Energía Neta Diaria</w:t>
+            </w:r>
+            <w:r>
+              <w:rPr>
+                <w:noProof/>
+                <w:webHidden/>
+              </w:rPr>
+              <w:tab/>
+            </w:r>
+            <w:r>
+              <w:rPr>
+                <w:noProof/>
+                <w:webHidden/>
+              </w:rPr>
+              <w:fldChar w:fldCharType="begin"/>
+            </w:r>
+            <w:r>
+              <w:rPr>
+                <w:noProof/>
+                <w:webHidden/>
+              </w:rPr>
+              <w:instrText xml:space="preserve"> PAGEREF _Toc243574093 \h </w:instrText>
+            </w:r>
+            <w:r>
+              <w:rPr>
+                <w:noProof/>
+                <w:webHidden/>
+              </w:rPr>
+            </w:r>
+            <w:r>
+              <w:rPr>
+                <w:noProof/>
+                <w:webHidden/>
+              </w:rPr>
+              <w:fldChar w:fldCharType="separate"/>
+            </w:r>
+            <w:r>
+              <w:rPr>
+                <w:noProof/>
+                <w:webHidden/>
+              </w:rPr>
+              <w:t>6</w:t>
+            </w:r>
+            <w:r>
+              <w:rPr>
+                <w:noProof/>
+                <w:webHidden/>
+              </w:rPr>
+              <w:fldChar w:fldCharType="end"/>
+            </w:r>
+          </w:hyperlink>
+        </w:p>
+        <w:p>
+          <w:pPr>
+            <w:pStyle w:val="TDC2"/>
+            <w:tabs>
+              <w:tab w:val="right" w:leader="dot" w:pos="8494"/>
+            </w:tabs>
+            <w:rPr>
+              <w:rFonts w:eastAsiaTheme="minorEastAsia"/>
+              <w:noProof/>
+              <w:kern w:val="0"/>
+              <w:sz w:val="22"/>
+              <w:szCs w:val="22"/>
+              <w:lang w:eastAsia="es-AR"/>
+              <w14:ligatures w14:val="none"/>
+            </w:rPr>
+          </w:pPr>
+          <w:hyperlink w:anchor="_Toc243574094" w:history="1">
+            <w:r>
+              <w:rPr>
+                <w:rStyle w:val="Hipervnculo"/>
+                <w:rFonts w:ascii="Times New Roman" w:eastAsia="Times New Roman" w:hAnsi="Times New Roman" w:cs="Times New Roman"/>
+                <w:iCs/>
+                <w:noProof/>
+                <w:lang w:eastAsia="es-AR"/>
+              </w:rPr>
+              <w:t>Porcentaje de Autoconsumo Cubierto</w:t>
+            </w:r>
+            <w:r>
+              <w:rPr>
+                <w:noProof/>
+                <w:webHidden/>
+              </w:rPr>
+              <w:tab/>
+            </w:r>
+            <w:r>
+              <w:rPr>
+                <w:noProof/>
+                <w:webHidden/>
+              </w:rPr>
+              <w:fldChar w:fldCharType="begin"/>
+            </w:r>
+            <w:r>
+              <w:rPr>
+                <w:noProof/>
+                <w:webHidden/>
+              </w:rPr>
+              <w:instrText xml:space="preserve"> PAGEREF _Toc243574094 \h </w:instrText>
+            </w:r>
+            <w:r>
+              <w:rPr>
+                <w:noProof/>
+                <w:webHidden/>
+              </w:rPr>
+            </w:r>
+            <w:r>
+              <w:rPr>
+                <w:noProof/>
+                <w:webHidden/>
+              </w:rPr>
+              <w:fldChar w:fldCharType="separate"/>
+            </w:r>
+            <w:r>
+              <w:rPr>
+                <w:noProof/>
+                <w:webHidden/>
+              </w:rPr>
+              <w:t>7</w:t>
+            </w:r>
+            <w:r>
+              <w:rPr>
+                <w:noProof/>
+                <w:webHidden/>
+              </w:rPr>
+              <w:fldChar w:fldCharType="end"/>
+            </w:r>
+          </w:hyperlink>
+        </w:p>
+        <w:p>
+          <w:pPr>
+            <w:pStyle w:val="TDC1"/>
+            <w:tabs>
+              <w:tab w:val="right" w:leader="dot" w:pos="8494"/>
+            </w:tabs>
+            <w:rPr>
+              <w:rFonts w:eastAsiaTheme="minorEastAsia"/>
+              <w:noProof/>
+              <w:kern w:val="0"/>
+              <w:sz w:val="22"/>
+              <w:szCs w:val="22"/>
+              <w:lang w:eastAsia="es-AR"/>
+              <w14:ligatures w14:val="none"/>
+            </w:rPr>
+          </w:pPr>
+          <w:hyperlink w:anchor="_Toc243574095" w:history="1">
+            <w:r>
+              <w:rPr>
+                <w:rStyle w:val="Hipervnculo"/>
+                <w:rFonts w:ascii="Times New Roman" w:eastAsia="Times New Roman" w:hAnsi="Times New Roman" w:cs="Times New Roman"/>
+                <w:b/>
+                <w:bCs/>
+                <w:noProof/>
+                <w:lang w:eastAsia="es-AR"/>
+              </w:rPr>
+              <w:t>4. Modelado de Descarga Pluvial y Análisis de Error</w:t>
+            </w:r>
+            <w:r>
+              <w:rPr>
+                <w:noProof/>
+                <w:webHidden/>
+              </w:rPr>
+              <w:tab/>
+            </w:r>
+            <w:r>
+              <w:rPr>
+                <w:noProof/>
+                <w:webHidden/>
+              </w:rPr>
+              <w:fldChar w:fldCharType="begin"/>
+            </w:r>
+            <w:r>
+              <w:rPr>
+                <w:noProof/>
+                <w:webHidden/>
+              </w:rPr>
+              <w:instrText xml:space="preserve"> PAGEREF _Toc243574095 \h </w:instrText>
+            </w:r>
+            <w:r>
+              <w:rPr>
+                <w:noProof/>
+                <w:webHidden/>
+              </w:rPr>
+            </w:r>
+            <w:r>
+              <w:rPr>
+                <w:noProof/>
+                <w:webHidden/>
+              </w:rPr>
+              <w:fldChar w:fldCharType="separate"/>
+            </w:r>
+            <w:r>
+              <w:rPr>
+                <w:noProof/>
+                <w:webHidden/>
+              </w:rPr>
+              <w:t>7</w:t>
+            </w:r>
+            <w:r>
+              <w:rPr>
+                <w:noProof/>
+                <w:webHidden/>
+              </w:rPr>
+              <w:fldChar w:fldCharType="end"/>
+            </w:r>
+          </w:hyperlink>
+        </w:p>
+        <w:p>
+          <w:pPr>
+            <w:pStyle w:val="TDC2"/>
+            <w:tabs>
+              <w:tab w:val="right" w:leader="dot" w:pos="8494"/>
+            </w:tabs>
+            <w:rPr>
+              <w:rFonts w:eastAsiaTheme="minorEastAsia"/>
+              <w:noProof/>
+              <w:kern w:val="0"/>
+              <w:sz w:val="22"/>
+              <w:szCs w:val="22"/>
+              <w:lang w:eastAsia="es-AR"/>
+              <w14:ligatures w14:val="none"/>
+            </w:rPr>
+          </w:pPr>
+          <w:hyperlink w:anchor="_Toc243574096" w:history="1">
+            <w:r>
+              <w:rPr>
+                <w:rStyle w:val="Hipervnculo"/>
+                <w:rFonts w:ascii="Times New Roman" w:eastAsia="Times New Roman" w:hAnsi="Times New Roman" w:cs="Times New Roman"/>
+                <w:iCs/>
+                <w:noProof/>
+                <w:lang w:eastAsia="es-AR"/>
+              </w:rPr>
+              <w:t>Cálculo Numérico del Volumen Drenado</w:t>
+            </w:r>
+            <w:r>
+              <w:rPr>
+                <w:noProof/>
+                <w:webHidden/>
+              </w:rPr>
+              <w:tab/>
+            </w:r>
+            <w:r>
+              <w:rPr>
+                <w:noProof/>
+                <w:webHidden/>
+              </w:rPr>
+              <w:fldChar w:fldCharType="begin"/>
+            </w:r>
+            <w:r>
+              <w:rPr>
+                <w:noProof/>
+                <w:webHidden/>
+              </w:rPr>
+              <w:instrText xml:space="preserve"> PAGEREF _Toc243574096 \h </w:instrText>
+            </w:r>
+            <w:r>
+              <w:rPr>
+                <w:noProof/>
+                <w:webHidden/>
+              </w:rPr>
+            </w:r>
+            <w:r>
+              <w:rPr>
+                <w:noProof/>
+                <w:webHidden/>
+              </w:rPr>
+              <w:fldChar w:fldCharType="separate"/>
+            </w:r>
+            <w:r>
+              <w:rPr>
+                <w:noProof/>
+                <w:webHidden/>
+              </w:rPr>
+              <w:t>7</w:t>
+            </w:r>
+            <w:r>
+              <w:rPr>
+                <w:noProof/>
+                <w:webHidden/>
+              </w:rPr>
+              <w:fldChar w:fldCharType="end"/>
+            </w:r>
+          </w:hyperlink>
+        </w:p>
+        <w:p>
+          <w:pPr>
+            <w:pStyle w:val="TDC2"/>
+            <w:tabs>
+              <w:tab w:val="right" w:leader="dot" w:pos="8494"/>
+            </w:tabs>
+            <w:rPr>
+              <w:rFonts w:eastAsiaTheme="minorEastAsia"/>
+              <w:noProof/>
+              <w:kern w:val="0"/>
+              <w:sz w:val="22"/>
+              <w:szCs w:val="22"/>
+              <w:lang w:eastAsia="es-AR"/>
+              <w14:ligatures w14:val="none"/>
+            </w:rPr>
+          </w:pPr>
+          <w:hyperlink w:anchor="_Toc243574097" w:history="1">
+            <w:r>
+              <w:rPr>
+                <w:rStyle w:val="Hipervnculo"/>
+                <w:rFonts w:ascii="Times New Roman" w:eastAsia="Times New Roman" w:hAnsi="Times New Roman" w:cs="Times New Roman"/>
+                <w:iCs/>
+                <w:noProof/>
+                <w:lang w:eastAsia="es-AR"/>
+              </w:rPr>
+              <w:t>Solución Analítica Exacta</w:t>
+            </w:r>
+            <w:r>
+              <w:rPr>
+                <w:noProof/>
+                <w:webHidden/>
+              </w:rPr>
+              <w:tab/>
+            </w:r>
+            <w:r>
+              <w:rPr>
+                <w:noProof/>
+                <w:webHidden/>
+              </w:rPr>
+              <w:fldChar w:fldCharType="begin"/>
+            </w:r>
+            <w:r>
+              <w:rPr>
+                <w:noProof/>
+                <w:webHidden/>
+              </w:rPr>
+              <w:instrText xml:space="preserve"> PAGEREF _Toc243574097 \h </w:instrText>
+            </w:r>
+            <w:r>
+              <w:rPr>
+                <w:noProof/>
+                <w:webHidden/>
+              </w:rPr>
+            </w:r>
+            <w:r>
+              <w:rPr>
+                <w:noProof/>
+                <w:webHidden/>
+              </w:rPr>
+              <w:fldChar w:fldCharType="separate"/>
+            </w:r>
+            <w:r>
+              <w:rPr>
+                <w:noProof/>
+                <w:webHidden/>
+              </w:rPr>
+              <w:t>8</w:t>
+            </w:r>
+            <w:r>
+              <w:rPr>
+                <w:noProof/>
+                <w:webHidden/>
+              </w:rPr>
+              <w:fldChar w:fldCharType="end"/>
+            </w:r>
+          </w:hyperlink>
+        </w:p>
+        <w:p>
+          <w:pPr>
+            <w:pStyle w:val="TDC2"/>
+            <w:tabs>
+              <w:tab w:val="right" w:leader="dot" w:pos="8494"/>
+            </w:tabs>
+            <w:rPr>
+              <w:rFonts w:eastAsiaTheme="minorEastAsia"/>
+              <w:noProof/>
+              <w:kern w:val="0"/>
+              <w:sz w:val="22"/>
+              <w:szCs w:val="22"/>
+              <w:lang w:eastAsia="es-AR"/>
+              <w14:ligatures w14:val="none"/>
+            </w:rPr>
+          </w:pPr>
+          <w:hyperlink w:anchor="_Toc243574098" w:history="1">
+            <w:r>
+              <w:rPr>
+                <w:rStyle w:val="Hipervnculo"/>
+                <w:rFonts w:ascii="Times New Roman" w:eastAsia="Times New Roman" w:hAnsi="Times New Roman" w:cs="Times New Roman"/>
+                <w:iCs/>
+                <w:noProof/>
+                <w:lang w:eastAsia="es-AR"/>
+              </w:rPr>
+              <w:t>Análisis de Discrepancias Geométricas</w:t>
+            </w:r>
+            <w:r>
+              <w:rPr>
+                <w:noProof/>
+                <w:webHidden/>
+              </w:rPr>
+              <w:tab/>
+            </w:r>
+            <w:r>
+              <w:rPr>
+                <w:noProof/>
+                <w:webHidden/>
+              </w:rPr>
+              <w:fldChar w:fldCharType="begin"/>
+            </w:r>
+            <w:r>
+              <w:rPr>
+                <w:noProof/>
+                <w:webHidden/>
+              </w:rPr>
+              <w:instrText xml:space="preserve"> PAGEREF _Toc243574098 \h </w:instrText>
+            </w:r>
+            <w:r>
+              <w:rPr>
+                <w:noProof/>
+                <w:webHidden/>
+              </w:rPr>
+            </w:r>
+            <w:r>
+              <w:rPr>
+                <w:noProof/>
+                <w:webHidden/>
+              </w:rPr>
+              <w:fldChar w:fldCharType="separate"/>
+            </w:r>
+            <w:r>
+              <w:rPr>
+                <w:noProof/>
+                <w:webHidden/>
+              </w:rPr>
+              <w:t>8</w:t>
+            </w:r>
+            <w:r>
+              <w:rPr>
+                <w:noProof/>
+                <w:webHidden/>
+              </w:rPr>
+              <w:fldChar w:fldCharType="end"/>
+            </w:r>
+          </w:hyperlink>
+        </w:p>
+        <w:p>
+          <w:pPr>
+            <w:pStyle w:val="TDC1"/>
+            <w:tabs>
+              <w:tab w:val="right" w:leader="dot" w:pos="8494"/>
+            </w:tabs>
+            <w:rPr>
+              <w:rFonts w:eastAsiaTheme="minorEastAsia"/>
+              <w:noProof/>
+              <w:kern w:val="0"/>
+              <w:sz w:val="22"/>
+              <w:szCs w:val="22"/>
+              <w:lang w:eastAsia="es-AR"/>
+              <w14:ligatures w14:val="none"/>
+            </w:rPr>
+          </w:pPr>
+          <w:hyperlink w:anchor="_Toc243574099" w:history="1">
+            <w:r>
+              <w:rPr>
+                <w:rStyle w:val="Hipervnculo"/>
+                <w:rFonts w:ascii="Times New Roman" w:eastAsia="Times New Roman" w:hAnsi="Times New Roman" w:cs="Times New Roman"/>
+                <w:b/>
+                <w:bCs/>
+                <w:noProof/>
+                <w:lang w:eastAsia="es-AR"/>
+              </w:rPr>
+              <w:t>Conclusión</w:t>
+            </w:r>
+            <w:r>
+              <w:rPr>
+                <w:noProof/>
+                <w:webHidden/>
+              </w:rPr>
+              <w:tab/>
+            </w:r>
+            <w:r>
+              <w:rPr>
+                <w:noProof/>
+                <w:webHidden/>
+              </w:rPr>
+              <w:fldChar w:fldCharType="begin"/>
+            </w:r>
+            <w:r>
+              <w:rPr>
+                <w:noProof/>
+                <w:webHidden/>
+              </w:rPr>
+              <w:instrText xml:space="preserve"> PAGEREF _Toc243574099 \h </w:instrText>
+            </w:r>
+            <w:r>
+              <w:rPr>
+                <w:noProof/>
+                <w:webHidden/>
+              </w:rPr>
+            </w:r>
+            <w:r>
+              <w:rPr>
+                <w:noProof/>
+                <w:webHidden/>
+              </w:rPr>
+              <w:fldChar w:fldCharType="separate"/>
+            </w:r>
+            <w:r>
+              <w:rPr>
+                <w:noProof/>
+                <w:webHidden/>
+              </w:rPr>
+              <w:t>9</w:t>
+            </w:r>
+            <w:r>
+              <w:rPr>
+                <w:noProof/>
+                <w:webHidden/>
+              </w:rPr>
+              <w:fldChar w:fldCharType="end"/>
+            </w:r>
+          </w:hyperlink>
+        </w:p>
+        <w:p>
+          <w:r>
+            <w:rPr>
+              <w:b/>
+              <w:bCs/>
+              <w:lang w:val="es-ES"/>
+            </w:rPr>
+            <w:fldChar w:fldCharType="end"/>
+          </w:r>
+        </w:p>
+      </w:sdtContent>
+    </w:sdt>
+    <w:p>
+      <w:pPr>
         <w:rPr>
           <w:rFonts w:ascii="Times New Roman" w:hAnsi="Times New Roman" w:cs="Times New Roman"/>
           <w:b/>
@@ -316,284 +1765,16 @@
     </w:p>
     <w:p>
       <w:pPr>
-        <w:jc w:val="center"/>
-        <w:rPr>
-          <w:rFonts w:ascii="Times New Roman" w:hAnsi="Times New Roman" w:cs="Times New Roman"/>
+        <w:rPr>
+          <w:rFonts w:ascii="Times New Roman" w:eastAsiaTheme="majorEastAsia" w:hAnsi="Times New Roman" w:cs="Times New Roman"/>
           <w:b/>
           <w:bCs/>
-          <w:sz w:val="32"/>
-          <w:szCs w:val="32"/>
-        </w:rPr>
-      </w:pPr>
-    </w:p>
-    <w:p>
-      <w:pPr>
-        <w:jc w:val="center"/>
-        <w:rPr>
-          <w:rFonts w:ascii="Times New Roman" w:hAnsi="Times New Roman" w:cs="Times New Roman"/>
-          <w:b/>
-          <w:bCs/>
-          <w:sz w:val="32"/>
-          <w:szCs w:val="32"/>
-        </w:rPr>
-      </w:pPr>
-    </w:p>
-    <w:p>
-      <w:pPr>
-        <w:jc w:val="center"/>
-        <w:rPr>
-          <w:rFonts w:ascii="Times New Roman" w:hAnsi="Times New Roman" w:cs="Times New Roman"/>
-          <w:b/>
-          <w:bCs/>
-          <w:sz w:val="32"/>
-          <w:szCs w:val="32"/>
-        </w:rPr>
-      </w:pPr>
-    </w:p>
-    <w:p>
-      <w:pPr>
-        <w:jc w:val="center"/>
-        <w:rPr>
-          <w:rFonts w:ascii="Times New Roman" w:hAnsi="Times New Roman" w:cs="Times New Roman"/>
-          <w:b/>
-          <w:bCs/>
-          <w:sz w:val="32"/>
-          <w:szCs w:val="32"/>
-        </w:rPr>
-      </w:pPr>
-    </w:p>
-    <w:p>
-      <w:pPr>
-        <w:jc w:val="center"/>
-        <w:rPr>
-          <w:rFonts w:ascii="Times New Roman" w:hAnsi="Times New Roman" w:cs="Times New Roman"/>
-          <w:b/>
-          <w:bCs/>
-          <w:sz w:val="32"/>
-          <w:szCs w:val="32"/>
-        </w:rPr>
-      </w:pPr>
-    </w:p>
-    <w:p>
-      <w:pPr>
-        <w:jc w:val="center"/>
-        <w:rPr>
-          <w:rFonts w:ascii="Times New Roman" w:hAnsi="Times New Roman" w:cs="Times New Roman"/>
-          <w:b/>
-          <w:bCs/>
-          <w:sz w:val="32"/>
-          <w:szCs w:val="32"/>
-        </w:rPr>
-      </w:pPr>
-    </w:p>
-    <w:p>
-      <w:pPr>
-        <w:jc w:val="center"/>
-        <w:rPr>
-          <w:rFonts w:ascii="Times New Roman" w:hAnsi="Times New Roman" w:cs="Times New Roman"/>
-          <w:b/>
-          <w:bCs/>
-          <w:sz w:val="32"/>
-          <w:szCs w:val="32"/>
-        </w:rPr>
-      </w:pPr>
-    </w:p>
-    <w:p>
-      <w:pPr>
-        <w:jc w:val="center"/>
-        <w:rPr>
-          <w:rFonts w:ascii="Times New Roman" w:hAnsi="Times New Roman" w:cs="Times New Roman"/>
-          <w:b/>
-          <w:bCs/>
-          <w:sz w:val="32"/>
-          <w:szCs w:val="32"/>
-        </w:rPr>
-      </w:pPr>
-    </w:p>
-    <w:p>
-      <w:pPr>
-        <w:jc w:val="center"/>
-        <w:rPr>
-          <w:rFonts w:ascii="Times New Roman" w:hAnsi="Times New Roman" w:cs="Times New Roman"/>
-          <w:b/>
-          <w:bCs/>
-          <w:sz w:val="32"/>
-          <w:szCs w:val="32"/>
-        </w:rPr>
-      </w:pPr>
-    </w:p>
-    <w:p>
-      <w:pPr>
-        <w:jc w:val="center"/>
-        <w:rPr>
-          <w:rFonts w:ascii="Times New Roman" w:hAnsi="Times New Roman" w:cs="Times New Roman"/>
-          <w:b/>
-          <w:bCs/>
-          <w:sz w:val="32"/>
-          <w:szCs w:val="32"/>
-        </w:rPr>
-      </w:pPr>
-    </w:p>
-    <w:p>
-      <w:pPr>
-        <w:jc w:val="center"/>
-        <w:rPr>
-          <w:rFonts w:ascii="Times New Roman" w:hAnsi="Times New Roman" w:cs="Times New Roman"/>
-          <w:b/>
-          <w:bCs/>
-          <w:sz w:val="32"/>
-          <w:szCs w:val="32"/>
-        </w:rPr>
-      </w:pPr>
-    </w:p>
-    <w:p>
-      <w:pPr>
-        <w:jc w:val="center"/>
-        <w:rPr>
-          <w:rFonts w:ascii="Times New Roman" w:hAnsi="Times New Roman" w:cs="Times New Roman"/>
-          <w:b/>
-          <w:bCs/>
-          <w:sz w:val="32"/>
-          <w:szCs w:val="32"/>
-        </w:rPr>
-      </w:pPr>
-    </w:p>
-    <w:p>
-      <w:pPr>
-        <w:jc w:val="center"/>
-        <w:rPr>
-          <w:rFonts w:ascii="Times New Roman" w:hAnsi="Times New Roman" w:cs="Times New Roman"/>
-          <w:b/>
-          <w:bCs/>
-          <w:sz w:val="32"/>
-          <w:szCs w:val="32"/>
-        </w:rPr>
-      </w:pPr>
-    </w:p>
-    <w:p>
-      <w:pPr>
-        <w:jc w:val="center"/>
-        <w:rPr>
-          <w:rFonts w:ascii="Times New Roman" w:hAnsi="Times New Roman" w:cs="Times New Roman"/>
-          <w:b/>
-          <w:bCs/>
-          <w:sz w:val="32"/>
-          <w:szCs w:val="32"/>
-        </w:rPr>
-      </w:pPr>
-    </w:p>
-    <w:p>
-      <w:pPr>
-        <w:jc w:val="center"/>
-        <w:rPr>
-          <w:rFonts w:ascii="Times New Roman" w:hAnsi="Times New Roman" w:cs="Times New Roman"/>
-          <w:b/>
-          <w:bCs/>
-          <w:sz w:val="32"/>
-          <w:szCs w:val="32"/>
-        </w:rPr>
-      </w:pPr>
-    </w:p>
-    <w:p>
-      <w:pPr>
-        <w:jc w:val="center"/>
-        <w:rPr>
-          <w:rFonts w:ascii="Times New Roman" w:hAnsi="Times New Roman" w:cs="Times New Roman"/>
-          <w:b/>
-          <w:bCs/>
-          <w:sz w:val="32"/>
-          <w:szCs w:val="32"/>
-        </w:rPr>
-      </w:pPr>
-    </w:p>
-    <w:p>
-      <w:pPr>
-        <w:jc w:val="center"/>
-        <w:rPr>
-          <w:rFonts w:ascii="Times New Roman" w:hAnsi="Times New Roman" w:cs="Times New Roman"/>
-          <w:b/>
-          <w:bCs/>
-          <w:sz w:val="32"/>
-          <w:szCs w:val="32"/>
-        </w:rPr>
-      </w:pPr>
-    </w:p>
-    <w:p>
-      <w:pPr>
-        <w:jc w:val="center"/>
-        <w:rPr>
-          <w:rFonts w:ascii="Times New Roman" w:hAnsi="Times New Roman" w:cs="Times New Roman"/>
-          <w:b/>
-          <w:bCs/>
-          <w:sz w:val="32"/>
-          <w:szCs w:val="32"/>
-        </w:rPr>
-      </w:pPr>
-    </w:p>
-    <w:p>
-      <w:pPr>
-        <w:jc w:val="center"/>
-        <w:rPr>
-          <w:rFonts w:ascii="Times New Roman" w:hAnsi="Times New Roman" w:cs="Times New Roman"/>
-          <w:b/>
-          <w:bCs/>
-          <w:sz w:val="32"/>
-          <w:szCs w:val="32"/>
-        </w:rPr>
-      </w:pPr>
-    </w:p>
-    <w:p>
-      <w:pPr>
-        <w:jc w:val="center"/>
-        <w:rPr>
-          <w:rFonts w:ascii="Times New Roman" w:hAnsi="Times New Roman" w:cs="Times New Roman"/>
-          <w:b/>
-          <w:bCs/>
-          <w:sz w:val="32"/>
-          <w:szCs w:val="32"/>
-        </w:rPr>
-      </w:pPr>
-    </w:p>
-    <w:p>
-      <w:pPr>
-        <w:jc w:val="center"/>
-        <w:rPr>
-          <w:rFonts w:ascii="Times New Roman" w:hAnsi="Times New Roman" w:cs="Times New Roman"/>
-          <w:b/>
-          <w:bCs/>
-          <w:sz w:val="32"/>
-          <w:szCs w:val="32"/>
-        </w:rPr>
-      </w:pPr>
-    </w:p>
-    <w:p>
-      <w:pPr>
-        <w:jc w:val="center"/>
-        <w:rPr>
-          <w:rFonts w:ascii="Times New Roman" w:hAnsi="Times New Roman" w:cs="Times New Roman"/>
-          <w:b/>
-          <w:bCs/>
-          <w:sz w:val="32"/>
-          <w:szCs w:val="32"/>
-        </w:rPr>
-      </w:pPr>
-    </w:p>
-    <w:p>
-      <w:pPr>
-        <w:jc w:val="center"/>
-        <w:rPr>
-          <w:rFonts w:ascii="Times New Roman" w:hAnsi="Times New Roman" w:cs="Times New Roman"/>
-          <w:b/>
-          <w:bCs/>
-          <w:sz w:val="32"/>
-          <w:szCs w:val="32"/>
-        </w:rPr>
-      </w:pPr>
-    </w:p>
-    <w:p>
-      <w:pPr>
-        <w:pStyle w:val="Ttulo1"/>
-        <w:jc w:val="both"/>
+          <w:color w:val="0F4761" w:themeColor="accent1" w:themeShade="BF"/>
+          <w:sz w:val="28"/>
+          <w:szCs w:val="28"/>
+        </w:rPr>
+      </w:pPr>
+      <w:r>
         <w:rPr>
           <w:rFonts w:ascii="Times New Roman" w:hAnsi="Times New Roman" w:cs="Times New Roman"/>
           <w:b/>
@@ -601,8 +1782,13 @@
           <w:sz w:val="28"/>
           <w:szCs w:val="28"/>
         </w:rPr>
-      </w:pPr>
-      <w:r>
+        <w:br w:type="page"/>
+      </w:r>
+    </w:p>
+    <w:p>
+      <w:pPr>
+        <w:pStyle w:val="Ttulo1"/>
+        <w:jc w:val="both"/>
         <w:rPr>
           <w:rFonts w:ascii="Times New Roman" w:hAnsi="Times New Roman" w:cs="Times New Roman"/>
           <w:b/>
@@ -610,59 +1796,9 @@
           <w:sz w:val="28"/>
           <w:szCs w:val="28"/>
         </w:rPr>
-        <w:lastRenderedPageBreak/>
-        <w:t>Introducción:</w:t>
-      </w:r>
-    </w:p>
-    <w:p>
-      <w:pPr>
-        <w:spacing w:line="276" w:lineRule="auto"/>
-        <w:jc w:val="both"/>
-        <w:rPr>
-          <w:rFonts w:ascii="Times New Roman" w:hAnsi="Times New Roman" w:cs="Times New Roman"/>
-          <w:sz w:val="22"/>
-          <w:szCs w:val="22"/>
-        </w:rPr>
-      </w:pPr>
-      <w:r>
-        <w:rPr>
-          <w:rFonts w:ascii="Times New Roman" w:hAnsi="Times New Roman" w:cs="Times New Roman"/>
-          <w:sz w:val="22"/>
-          <w:szCs w:val="22"/>
-        </w:rPr>
-        <w:t xml:space="preserve">Como parte del plan de sustentabilidad energética y gestión hídrica de la Universidad, en este trabajo auditamos la capacidad de captación solar y el impacto del drenaje pluvial en las cubiertas de la facultad. Tomando los datos espaciales y la escala satelital provista (1 </w:t>
-      </w:r>
-      <w:proofErr w:type="spellStart"/>
-      <w:r>
-        <w:rPr>
-          <w:rFonts w:ascii="Times New Roman" w:hAnsi="Times New Roman" w:cs="Times New Roman"/>
-          <w:sz w:val="22"/>
-          <w:szCs w:val="22"/>
-        </w:rPr>
-        <w:t>px</w:t>
-      </w:r>
-      <w:proofErr w:type="spellEnd"/>
-      <w:r>
-        <w:rPr>
-          <w:rFonts w:ascii="Times New Roman" w:hAnsi="Times New Roman" w:cs="Times New Roman"/>
-          <w:sz w:val="22"/>
-          <w:szCs w:val="22"/>
-        </w:rPr>
-        <w:t xml:space="preserve"> = 0.5073 m), aplicamos y comparamos distintas técnicas de integración numérica, desarrolladas desde cero, para cuantificar superficies, analizar la generación de energía y evaluar volúmenes hídricos</w:t>
-      </w:r>
-      <w:r>
-        <w:rPr>
-          <w:rFonts w:ascii="Times New Roman" w:hAnsi="Times New Roman" w:cs="Times New Roman"/>
-          <w:sz w:val="22"/>
-          <w:szCs w:val="22"/>
-        </w:rPr>
-        <w:t>.</w:t>
-      </w:r>
-    </w:p>
-    <w:p>
-      <w:pPr>
-        <w:pStyle w:val="Ttulo1"/>
-        <w:jc w:val="both"/>
+      </w:pPr>
+      <w:bookmarkStart w:id="1" w:name="_Toc243574082"/>
+      <w:r>
         <w:rPr>
           <w:rFonts w:ascii="Times New Roman" w:hAnsi="Times New Roman" w:cs="Times New Roman"/>
           <w:b/>
@@ -670,8 +1806,52 @@
           <w:sz w:val="28"/>
           <w:szCs w:val="28"/>
         </w:rPr>
-      </w:pPr>
-      <w:r>
+        <w:lastRenderedPageBreak/>
+        <w:t>Introducción:</w:t>
+      </w:r>
+      <w:bookmarkEnd w:id="1"/>
+    </w:p>
+    <w:p>
+      <w:pPr>
+        <w:spacing w:line="276" w:lineRule="auto"/>
+        <w:jc w:val="both"/>
+        <w:rPr>
+          <w:rFonts w:ascii="Times New Roman" w:hAnsi="Times New Roman" w:cs="Times New Roman"/>
+          <w:sz w:val="22"/>
+          <w:szCs w:val="22"/>
+        </w:rPr>
+      </w:pPr>
+      <w:r>
+        <w:rPr>
+          <w:rFonts w:ascii="Times New Roman" w:hAnsi="Times New Roman" w:cs="Times New Roman"/>
+          <w:sz w:val="22"/>
+          <w:szCs w:val="22"/>
+        </w:rPr>
+        <w:t xml:space="preserve">Como parte del plan de sustentabilidad energética y gestión hídrica de la Universidad, en este trabajo auditamos la capacidad de captación solar y el impacto del drenaje pluvial en las cubiertas de la facultad. Tomando los datos espaciales y la escala satelital provista (1 </w:t>
+      </w:r>
+      <w:proofErr w:type="spellStart"/>
+      <w:r>
+        <w:rPr>
+          <w:rFonts w:ascii="Times New Roman" w:hAnsi="Times New Roman" w:cs="Times New Roman"/>
+          <w:sz w:val="22"/>
+          <w:szCs w:val="22"/>
+        </w:rPr>
+        <w:t>px</w:t>
+      </w:r>
+      <w:proofErr w:type="spellEnd"/>
+      <w:r>
+        <w:rPr>
+          <w:rFonts w:ascii="Times New Roman" w:hAnsi="Times New Roman" w:cs="Times New Roman"/>
+          <w:sz w:val="22"/>
+          <w:szCs w:val="22"/>
+        </w:rPr>
+        <w:t xml:space="preserve"> = 0.5073 m), aplicamos y comparamos distintas técnicas de integración numérica, desarrolladas desde cero, para cuantificar superficies, analizar la generación de energía y evaluar volúmenes hídricos.</w:t>
+      </w:r>
+    </w:p>
+    <w:p>
+      <w:pPr>
+        <w:pStyle w:val="Ttulo1"/>
+        <w:jc w:val="both"/>
         <w:rPr>
           <w:rFonts w:ascii="Times New Roman" w:hAnsi="Times New Roman" w:cs="Times New Roman"/>
           <w:b/>
@@ -679,8 +1859,19 @@
           <w:sz w:val="28"/>
           <w:szCs w:val="28"/>
         </w:rPr>
+      </w:pPr>
+      <w:bookmarkStart w:id="2" w:name="_Toc243574083"/>
+      <w:r>
+        <w:rPr>
+          <w:rFonts w:ascii="Times New Roman" w:hAnsi="Times New Roman" w:cs="Times New Roman"/>
+          <w:b/>
+          <w:bCs/>
+          <w:sz w:val="28"/>
+          <w:szCs w:val="28"/>
+        </w:rPr>
         <w:t>1. Superficie de los techos</w:t>
       </w:r>
+      <w:bookmarkEnd w:id="2"/>
     </w:p>
     <w:p>
       <w:pPr>
@@ -791,15 +1982,7 @@
           <w:sz w:val="22"/>
           <w:szCs w:val="22"/>
         </w:rPr>
-        <w:t xml:space="preserve"> de los edificios principales a partir del archivo proporcionado </w:t>
-      </w:r>
-      <w:r>
-        <w:rPr>
-          <w:rFonts w:ascii="Times New Roman" w:hAnsi="Times New Roman" w:cs="Times New Roman"/>
-          <w:sz w:val="22"/>
-          <w:szCs w:val="22"/>
-        </w:rPr>
-        <w:t>“</w:t>
+        <w:t xml:space="preserve"> de los edificios principales a partir del archivo proporcionado “</w:t>
       </w:r>
       <w:proofErr w:type="spellStart"/>
       <w:r>
@@ -817,15 +2000,7 @@
           <w:sz w:val="22"/>
           <w:szCs w:val="22"/>
         </w:rPr>
-        <w:t>”</w:t>
-      </w:r>
-      <w:r>
-        <w:rPr>
-          <w:rFonts w:ascii="Times New Roman" w:hAnsi="Times New Roman" w:cs="Times New Roman"/>
-          <w:sz w:val="22"/>
-          <w:szCs w:val="22"/>
-        </w:rPr>
-        <w:t xml:space="preserve">. Interpretamos estos puntos como los vértices consecutivos de una poligonal que aproxima el contorno de cada techo. Para garantizar que la región estuviera cerrada, nuestro algoritmo conecta el último nodo con el primero automáticamente. </w:t>
+        <w:t xml:space="preserve">”. Interpretamos estos puntos como los vértices consecutivos de una poligonal que aproxima el contorno de cada techo. Para garantizar que la región estuviera cerrada, nuestro algoritmo conecta el último nodo con el primero automáticamente. </w:t>
       </w:r>
     </w:p>
     <w:p>
@@ -834,22 +2009,22 @@
         <w:jc w:val="both"/>
         <w:rPr>
           <w:rFonts w:ascii="Times New Roman" w:hAnsi="Times New Roman" w:cs="Times New Roman"/>
-          <w:i/>
           <w:iCs/>
           <w:sz w:val="24"/>
           <w:szCs w:val="24"/>
         </w:rPr>
       </w:pPr>
-      <w:r>
-        <w:rPr>
-          <w:rFonts w:ascii="Times New Roman" w:hAnsi="Times New Roman" w:cs="Times New Roman"/>
-          <w:i/>
+      <w:bookmarkStart w:id="3" w:name="_Toc243574084"/>
+      <w:r>
+        <w:rPr>
+          <w:rFonts w:ascii="Times New Roman" w:hAnsi="Times New Roman" w:cs="Times New Roman"/>
           <w:iCs/>
           <w:sz w:val="24"/>
           <w:szCs w:val="24"/>
         </w:rPr>
         <w:t>Justificación del método seleccionado</w:t>
       </w:r>
+      <w:bookmarkEnd w:id="3"/>
     </w:p>
     <w:p>
       <w:pPr>
@@ -954,22 +2129,22 @@
         <w:jc w:val="both"/>
         <w:rPr>
           <w:rFonts w:ascii="Times New Roman" w:hAnsi="Times New Roman" w:cs="Times New Roman"/>
-          <w:i/>
           <w:iCs/>
           <w:sz w:val="24"/>
           <w:szCs w:val="24"/>
         </w:rPr>
       </w:pPr>
-      <w:r>
-        <w:rPr>
-          <w:rFonts w:ascii="Times New Roman" w:hAnsi="Times New Roman" w:cs="Times New Roman"/>
-          <w:i/>
+      <w:bookmarkStart w:id="4" w:name="_Toc243574085"/>
+      <w:r>
+        <w:rPr>
+          <w:rFonts w:ascii="Times New Roman" w:hAnsi="Times New Roman" w:cs="Times New Roman"/>
           <w:iCs/>
           <w:sz w:val="24"/>
           <w:szCs w:val="24"/>
         </w:rPr>
         <w:t>Cálculo y conversión de escala</w:t>
       </w:r>
+      <w:bookmarkEnd w:id="4"/>
     </w:p>
     <w:p>
       <w:pPr>
@@ -1473,8 +2648,10 @@
       <w:r>
         <w:rPr>
           <w:rFonts w:ascii="Times New Roman" w:hAnsi="Times New Roman" w:cs="Times New Roman"/>
-          <w:sz w:val="22"/>
-          <w:szCs w:val="22"/>
+          <w:noProof/>
+          <w:sz w:val="22"/>
+          <w:szCs w:val="22"/>
+          <w:lang w:eastAsia="es-AR"/>
         </w:rPr>
         <w:lastRenderedPageBreak/>
         <w:drawing>
@@ -1495,7 +2672,7 @@
                     </pic:cNvPicPr>
                   </pic:nvPicPr>
                   <pic:blipFill>
-                    <a:blip r:embed="rId6" cstate="print">
+                    <a:blip r:embed="rId7" cstate="print">
                       <a:extLst>
                         <a:ext uri="{28A0092B-C50C-407E-A947-70E740481C1C}">
                           <a14:useLocalDpi xmlns:a14="http://schemas.microsoft.com/office/drawing/2010/main" val="0"/>
@@ -1578,22 +2755,22 @@
         <w:jc w:val="both"/>
         <w:rPr>
           <w:rFonts w:ascii="Times New Roman" w:hAnsi="Times New Roman" w:cs="Times New Roman"/>
-          <w:i/>
           <w:iCs/>
           <w:sz w:val="24"/>
           <w:szCs w:val="24"/>
         </w:rPr>
       </w:pPr>
-      <w:r>
-        <w:rPr>
-          <w:rFonts w:ascii="Times New Roman" w:hAnsi="Times New Roman" w:cs="Times New Roman"/>
-          <w:i/>
+      <w:bookmarkStart w:id="5" w:name="_Toc243574086"/>
+      <w:r>
+        <w:rPr>
+          <w:rFonts w:ascii="Times New Roman" w:hAnsi="Times New Roman" w:cs="Times New Roman"/>
           <w:iCs/>
           <w:sz w:val="24"/>
           <w:szCs w:val="24"/>
         </w:rPr>
         <w:t>Análisis de errores geométricos</w:t>
       </w:r>
+      <w:bookmarkEnd w:id="5"/>
     </w:p>
     <w:p>
       <w:pPr>
@@ -1626,6 +2803,7 @@
           <w:szCs w:val="28"/>
         </w:rPr>
       </w:pPr>
+      <w:bookmarkStart w:id="6" w:name="_Toc243574087"/>
       <w:r>
         <w:rPr>
           <w:rFonts w:ascii="Times New Roman" w:hAnsi="Times New Roman" w:cs="Times New Roman"/>
@@ -1636,6 +2814,7 @@
         </w:rPr>
         <w:t>2. Radiación Solar y Análisis de Error</w:t>
       </w:r>
+      <w:bookmarkEnd w:id="6"/>
     </w:p>
     <w:p>
       <w:pPr>
@@ -1643,22 +2822,22 @@
         <w:jc w:val="both"/>
         <w:rPr>
           <w:rFonts w:ascii="Times New Roman" w:hAnsi="Times New Roman" w:cs="Times New Roman"/>
-          <w:i/>
           <w:iCs/>
           <w:sz w:val="24"/>
           <w:szCs w:val="24"/>
         </w:rPr>
       </w:pPr>
-      <w:r>
-        <w:rPr>
-          <w:rFonts w:ascii="Times New Roman" w:hAnsi="Times New Roman" w:cs="Times New Roman"/>
-          <w:i/>
+      <w:bookmarkStart w:id="7" w:name="_Toc243574088"/>
+      <w:r>
+        <w:rPr>
+          <w:rFonts w:ascii="Times New Roman" w:hAnsi="Times New Roman" w:cs="Times New Roman"/>
           <w:iCs/>
           <w:sz w:val="24"/>
           <w:szCs w:val="24"/>
         </w:rPr>
         <w:t>Cálculo de la Irradiancia Diaria Acumulada</w:t>
       </w:r>
+      <w:bookmarkEnd w:id="7"/>
     </w:p>
     <w:p>
       <w:pPr>
@@ -1948,16 +3127,15 @@
         <w:jc w:val="both"/>
         <w:rPr>
           <w:rFonts w:ascii="Times New Roman" w:hAnsi="Times New Roman" w:cs="Times New Roman"/>
-          <w:i/>
           <w:iCs/>
           <w:sz w:val="24"/>
           <w:szCs w:val="24"/>
         </w:rPr>
       </w:pPr>
-      <w:r>
-        <w:rPr>
-          <w:rFonts w:ascii="Times New Roman" w:hAnsi="Times New Roman" w:cs="Times New Roman"/>
-          <w:i/>
+      <w:bookmarkStart w:id="8" w:name="_Toc243574089"/>
+      <w:r>
+        <w:rPr>
+          <w:rFonts w:ascii="Times New Roman" w:hAnsi="Times New Roman" w:cs="Times New Roman"/>
           <w:iCs/>
           <w:sz w:val="24"/>
           <w:szCs w:val="24"/>
@@ -1965,6 +3143,7 @@
         <w:lastRenderedPageBreak/>
         <w:t>Estimación Empírica del Error de Truncamiento</w:t>
       </w:r>
+      <w:bookmarkEnd w:id="8"/>
     </w:p>
     <w:p>
       <w:pPr>
@@ -2218,29 +3397,7 @@
           <w:lang w:eastAsia="es-AR"/>
           <w14:ligatures w14:val="none"/>
         </w:rPr>
-        <w:t xml:space="preserve">) demuestra experimentalmente </w:t>
-      </w:r>
-      <w:r>
-        <w:rPr>
-          <w:rFonts w:ascii="Times New Roman" w:eastAsia="Times New Roman" w:hAnsi="Times New Roman" w:cs="Times New Roman"/>
-          <w:kern w:val="0"/>
-          <w:sz w:val="22"/>
-          <w:szCs w:val="22"/>
-          <w:lang w:eastAsia="es-AR"/>
-          <w14:ligatures w14:val="none"/>
-        </w:rPr>
-        <w:t>que,</w:t>
-      </w:r>
-      <w:r>
-        <w:rPr>
-          <w:rFonts w:ascii="Times New Roman" w:eastAsia="Times New Roman" w:hAnsi="Times New Roman" w:cs="Times New Roman"/>
-          <w:kern w:val="0"/>
-          <w:sz w:val="22"/>
-          <w:szCs w:val="22"/>
-          <w:lang w:eastAsia="es-AR"/>
-          <w14:ligatures w14:val="none"/>
-        </w:rPr>
-        <w:t xml:space="preserve"> al reducir el paso a la mitad, el error de nuestra implementación se reduce efectivamente en un factor de 16 (</w:t>
+        <w:t>) demuestra experimentalmente que, al reducir el paso a la mitad, el error de nuestra implementación se reduce efectivamente en un factor de 16 (</w:t>
       </w:r>
       <m:oMath>
         <m:sSup>
@@ -2350,7 +3507,7 @@
                     </pic:cNvPicPr>
                   </pic:nvPicPr>
                   <pic:blipFill>
-                    <a:blip r:embed="rId7" cstate="print">
+                    <a:blip r:embed="rId8" cstate="print">
                       <a:extLst>
                         <a:ext uri="{28A0092B-C50C-407E-A947-70E740481C1C}">
                           <a14:useLocalDpi xmlns:a14="http://schemas.microsoft.com/office/drawing/2010/main" val="0"/>
@@ -2457,17 +3614,16 @@
         <w:jc w:val="both"/>
         <w:rPr>
           <w:rFonts w:ascii="Times New Roman" w:eastAsia="Times New Roman" w:hAnsi="Times New Roman" w:cs="Times New Roman"/>
-          <w:i/>
           <w:iCs/>
           <w:sz w:val="24"/>
           <w:szCs w:val="24"/>
           <w:lang w:eastAsia="es-AR"/>
         </w:rPr>
       </w:pPr>
-      <w:r>
-        <w:rPr>
-          <w:rFonts w:ascii="Times New Roman" w:eastAsia="Times New Roman" w:hAnsi="Times New Roman" w:cs="Times New Roman"/>
-          <w:i/>
+      <w:bookmarkStart w:id="9" w:name="_Toc243574090"/>
+      <w:r>
+        <w:rPr>
+          <w:rFonts w:ascii="Times New Roman" w:eastAsia="Times New Roman" w:hAnsi="Times New Roman" w:cs="Times New Roman"/>
           <w:iCs/>
           <w:sz w:val="24"/>
           <w:szCs w:val="24"/>
@@ -2475,6 +3631,7 @@
         </w:rPr>
         <w:t>Impacto de la Nubosidad y Submuestreo Espacial</w:t>
       </w:r>
+      <w:bookmarkEnd w:id="9"/>
     </w:p>
     <w:p>
       <w:pPr>
@@ -2724,7 +3881,7 @@
                     </pic:cNvPicPr>
                   </pic:nvPicPr>
                   <pic:blipFill>
-                    <a:blip r:embed="rId8" cstate="print">
+                    <a:blip r:embed="rId9" cstate="print">
                       <a:extLst>
                         <a:ext uri="{28A0092B-C50C-407E-A947-70E740481C1C}">
                           <a14:useLocalDpi xmlns:a14="http://schemas.microsoft.com/office/drawing/2010/main" val="0"/>
@@ -3224,6 +4381,7 @@
           <w:lang w:eastAsia="es-AR"/>
         </w:rPr>
       </w:pPr>
+      <w:bookmarkStart w:id="10" w:name="_Toc243574091"/>
       <w:r>
         <w:rPr>
           <w:rFonts w:ascii="Times New Roman" w:eastAsia="Times New Roman" w:hAnsi="Times New Roman" w:cs="Times New Roman"/>
@@ -3235,6 +4393,7 @@
         </w:rPr>
         <w:t>3. Generación Fotovoltaica</w:t>
       </w:r>
+      <w:bookmarkEnd w:id="10"/>
     </w:p>
     <w:p>
       <w:pPr>
@@ -3242,17 +4401,16 @@
         <w:jc w:val="both"/>
         <w:rPr>
           <w:rFonts w:ascii="Times New Roman" w:eastAsia="Times New Roman" w:hAnsi="Times New Roman" w:cs="Times New Roman"/>
-          <w:i/>
           <w:iCs/>
           <w:sz w:val="24"/>
           <w:szCs w:val="24"/>
           <w:lang w:eastAsia="es-AR"/>
         </w:rPr>
       </w:pPr>
-      <w:r>
-        <w:rPr>
-          <w:rFonts w:ascii="Times New Roman" w:eastAsia="Times New Roman" w:hAnsi="Times New Roman" w:cs="Times New Roman"/>
-          <w:i/>
+      <w:bookmarkStart w:id="11" w:name="_Toc243574092"/>
+      <w:r>
+        <w:rPr>
+          <w:rFonts w:ascii="Times New Roman" w:eastAsia="Times New Roman" w:hAnsi="Times New Roman" w:cs="Times New Roman"/>
           <w:iCs/>
           <w:sz w:val="24"/>
           <w:szCs w:val="24"/>
@@ -3260,6 +4418,7 @@
         </w:rPr>
         <w:t>Dimensionamiento del Parque Solar</w:t>
       </w:r>
+      <w:bookmarkEnd w:id="11"/>
     </w:p>
     <w:p>
       <w:pPr>
@@ -3799,17 +4958,16 @@
         <w:jc w:val="both"/>
         <w:rPr>
           <w:rFonts w:ascii="Times New Roman" w:eastAsia="Times New Roman" w:hAnsi="Times New Roman" w:cs="Times New Roman"/>
-          <w:i/>
           <w:iCs/>
           <w:sz w:val="24"/>
           <w:szCs w:val="24"/>
           <w:lang w:eastAsia="es-AR"/>
         </w:rPr>
       </w:pPr>
-      <w:r>
-        <w:rPr>
-          <w:rFonts w:ascii="Times New Roman" w:eastAsia="Times New Roman" w:hAnsi="Times New Roman" w:cs="Times New Roman"/>
-          <w:i/>
+      <w:bookmarkStart w:id="12" w:name="_Toc243574093"/>
+      <w:r>
+        <w:rPr>
+          <w:rFonts w:ascii="Times New Roman" w:eastAsia="Times New Roman" w:hAnsi="Times New Roman" w:cs="Times New Roman"/>
           <w:iCs/>
           <w:sz w:val="24"/>
           <w:szCs w:val="24"/>
@@ -3817,6 +4975,7 @@
         </w:rPr>
         <w:t>Integración de la Energía Neta Diaria</w:t>
       </w:r>
+      <w:bookmarkEnd w:id="12"/>
     </w:p>
     <w:p>
       <w:pPr>
@@ -4005,7 +5164,7 @@
                     </pic:cNvPicPr>
                   </pic:nvPicPr>
                   <pic:blipFill>
-                    <a:blip r:embed="rId9" cstate="print">
+                    <a:blip r:embed="rId10" cstate="print">
                       <a:extLst>
                         <a:ext uri="{28A0092B-C50C-407E-A947-70E740481C1C}">
                           <a14:useLocalDpi xmlns:a14="http://schemas.microsoft.com/office/drawing/2010/main" val="0"/>
@@ -4504,17 +5663,16 @@
         <w:pStyle w:val="Ttulo2"/>
         <w:rPr>
           <w:rFonts w:ascii="Times New Roman" w:eastAsia="Times New Roman" w:hAnsi="Times New Roman" w:cs="Times New Roman"/>
-          <w:i/>
           <w:iCs/>
           <w:sz w:val="24"/>
           <w:szCs w:val="24"/>
           <w:lang w:eastAsia="es-AR"/>
         </w:rPr>
       </w:pPr>
-      <w:r>
-        <w:rPr>
-          <w:rFonts w:ascii="Times New Roman" w:eastAsia="Times New Roman" w:hAnsi="Times New Roman" w:cs="Times New Roman"/>
-          <w:i/>
+      <w:bookmarkStart w:id="13" w:name="_Toc243574094"/>
+      <w:r>
+        <w:rPr>
+          <w:rFonts w:ascii="Times New Roman" w:eastAsia="Times New Roman" w:hAnsi="Times New Roman" w:cs="Times New Roman"/>
           <w:iCs/>
           <w:sz w:val="24"/>
           <w:szCs w:val="24"/>
@@ -4522,6 +5680,7 @@
         </w:rPr>
         <w:t>Porcentaje de Autoconsumo Cubierto</w:t>
       </w:r>
+      <w:bookmarkEnd w:id="13"/>
     </w:p>
     <w:p>
       <w:pPr>
@@ -4723,6 +5882,7 @@
           <w:lang w:eastAsia="es-AR"/>
         </w:rPr>
       </w:pPr>
+      <w:bookmarkStart w:id="14" w:name="_Toc243574095"/>
       <w:r>
         <w:rPr>
           <w:rFonts w:ascii="Times New Roman" w:eastAsia="Times New Roman" w:hAnsi="Times New Roman" w:cs="Times New Roman"/>
@@ -4734,23 +5894,23 @@
         </w:rPr>
         <w:t>4. Modelado de Descarga Pluvial y Análisis de Error</w:t>
       </w:r>
+      <w:bookmarkEnd w:id="14"/>
     </w:p>
     <w:p>
       <w:pPr>
         <w:pStyle w:val="Ttulo2"/>
         <w:rPr>
           <w:rFonts w:ascii="Times New Roman" w:eastAsia="Times New Roman" w:hAnsi="Times New Roman" w:cs="Times New Roman"/>
-          <w:i/>
           <w:iCs/>
           <w:sz w:val="24"/>
           <w:szCs w:val="24"/>
           <w:lang w:eastAsia="es-AR"/>
         </w:rPr>
       </w:pPr>
-      <w:r>
-        <w:rPr>
-          <w:rFonts w:ascii="Times New Roman" w:eastAsia="Times New Roman" w:hAnsi="Times New Roman" w:cs="Times New Roman"/>
-          <w:i/>
+      <w:bookmarkStart w:id="15" w:name="_Toc243574096"/>
+      <w:r>
+        <w:rPr>
+          <w:rFonts w:ascii="Times New Roman" w:eastAsia="Times New Roman" w:hAnsi="Times New Roman" w:cs="Times New Roman"/>
           <w:iCs/>
           <w:sz w:val="24"/>
           <w:szCs w:val="24"/>
@@ -4758,6 +5918,7 @@
         </w:rPr>
         <w:t>Cálculo Numérico del Volumen Drenado</w:t>
       </w:r>
+      <w:bookmarkEnd w:id="15"/>
     </w:p>
     <w:p>
       <w:pPr>
@@ -5367,17 +6528,16 @@
         <w:pStyle w:val="Ttulo2"/>
         <w:rPr>
           <w:rFonts w:ascii="Times New Roman" w:eastAsia="Times New Roman" w:hAnsi="Times New Roman" w:cs="Times New Roman"/>
-          <w:i/>
           <w:iCs/>
           <w:sz w:val="24"/>
           <w:szCs w:val="24"/>
           <w:lang w:eastAsia="es-AR"/>
         </w:rPr>
       </w:pPr>
-      <w:r>
-        <w:rPr>
-          <w:rFonts w:ascii="Times New Roman" w:eastAsia="Times New Roman" w:hAnsi="Times New Roman" w:cs="Times New Roman"/>
-          <w:i/>
+      <w:bookmarkStart w:id="16" w:name="_Toc243574097"/>
+      <w:r>
+        <w:rPr>
+          <w:rFonts w:ascii="Times New Roman" w:eastAsia="Times New Roman" w:hAnsi="Times New Roman" w:cs="Times New Roman"/>
           <w:iCs/>
           <w:sz w:val="24"/>
           <w:szCs w:val="24"/>
@@ -5385,6 +6545,7 @@
         </w:rPr>
         <w:t>Solución Analítica Exacta</w:t>
       </w:r>
+      <w:bookmarkEnd w:id="16"/>
     </w:p>
     <w:p>
       <w:pPr>
@@ -6206,17 +7367,16 @@
         <w:pStyle w:val="Ttulo2"/>
         <w:rPr>
           <w:rFonts w:ascii="Times New Roman" w:eastAsia="Times New Roman" w:hAnsi="Times New Roman" w:cs="Times New Roman"/>
-          <w:i/>
           <w:iCs/>
           <w:sz w:val="24"/>
           <w:szCs w:val="24"/>
           <w:lang w:eastAsia="es-AR"/>
         </w:rPr>
       </w:pPr>
-      <w:r>
-        <w:rPr>
-          <w:rFonts w:ascii="Times New Roman" w:eastAsia="Times New Roman" w:hAnsi="Times New Roman" w:cs="Times New Roman"/>
-          <w:i/>
+      <w:bookmarkStart w:id="17" w:name="_Toc243574098"/>
+      <w:r>
+        <w:rPr>
+          <w:rFonts w:ascii="Times New Roman" w:eastAsia="Times New Roman" w:hAnsi="Times New Roman" w:cs="Times New Roman"/>
           <w:iCs/>
           <w:sz w:val="24"/>
           <w:szCs w:val="24"/>
@@ -6224,6 +7384,7 @@
         </w:rPr>
         <w:t>Análisis de Discrepancias Geométricas</w:t>
       </w:r>
+      <w:bookmarkEnd w:id="17"/>
     </w:p>
     <w:p>
       <w:pPr>
@@ -6731,6 +7892,7 @@
           <w:lang w:eastAsia="es-AR"/>
         </w:rPr>
       </w:pPr>
+      <w:bookmarkStart w:id="18" w:name="_Toc243574099"/>
       <w:r>
         <w:rPr>
           <w:rFonts w:ascii="Times New Roman" w:eastAsia="Times New Roman" w:hAnsi="Times New Roman" w:cs="Times New Roman"/>
@@ -6741,7 +7903,19 @@
           <w:lang w:eastAsia="es-AR"/>
         </w:rPr>
         <w:lastRenderedPageBreak/>
-        <w:t xml:space="preserve">Conclusión </w:t>
+        <w:t>Conclusión</w:t>
+      </w:r>
+      <w:bookmarkEnd w:id="18"/>
+      <w:r>
+        <w:rPr>
+          <w:rFonts w:ascii="Times New Roman" w:eastAsia="Times New Roman" w:hAnsi="Times New Roman" w:cs="Times New Roman"/>
+          <w:b/>
+          <w:bCs/>
+          <w:sz w:val="28"/>
+          <w:szCs w:val="28"/>
+          <w:lang w:eastAsia="es-AR"/>
+        </w:rPr>
+        <w:t xml:space="preserve"> </w:t>
       </w:r>
     </w:p>
     <w:p>
@@ -6896,7 +8070,7 @@
 </file>
 
 <file path=word/numbering.xml><?xml version="1.0" encoding="utf-8"?>
-<w:numbering xmlns:wpc="http://schemas.microsoft.com/office/word/2010/wordprocessingCanvas" xmlns:cx="http://schemas.microsoft.com/office/drawing/2014/chartex" xmlns:cx1="http://schemas.microsoft.com/office/drawing/2015/9/8/chartex" xmlns:cx2="http://schemas.microsoft.com/office/drawing/2015/10/21/chartex" xmlns:cx3="http://schemas.microsoft.com/office/drawing/2016/5/9/chartex" xmlns:cx4="http://schemas.microsoft.com/office/drawing/2016/5/10/chartex" xmlns:cx5="http://schemas.microsoft.com/office/drawing/2016/5/11/chartex" xmlns:cx6="http://schemas.microsoft.com/office/drawing/2016/5/12/chartex" xmlns:cx7="http://schemas.microsoft.com/office/drawing/2016/5/13/chartex" xmlns:cx8="http://schemas.microsoft.com/office/drawing/2016/5/14/chartex" xmlns:mc="http://schemas.openxmlformats.org/markup-compatibility/2006" xmlns:aink="http://schemas.microsoft.com/office/drawing/2016/ink" xmlns:am3d="http://schemas.microsoft.com/office/drawing/2017/model3d" xmlns:o="urn:schemas-microsoft-com:office:office" xmlns:oel="http://schemas.microsoft.com/office/2019/extlst" xmlns:r="http://schemas.openxmlformats.org/officeDocument/2006/relationships" xmlns:m="http://schemas.openxmlformats.org/officeDocument/2006/math" xmlns:v="urn:schemas-microsoft-com:vml" xmlns:wp14="http://schemas.microsoft.com/office/word/2010/wordprocessingDrawing" xmlns:wp="http://schemas.openxmlformats.org/drawingml/2006/wordprocessingDrawing" xmlns:w10="urn:schemas-microsoft-com:office:word" xmlns:w="http://schemas.openxmlformats.org/wordprocessingml/2006/main" xmlns:w14="http://schemas.microsoft.com/office/word/2010/wordml" xmlns:w15="http://schemas.microsoft.com/office/word/2012/wordml" xmlns:w16cex="http://schemas.microsoft.com/office/word/2018/wordml/cex" xmlns:w16cid="http://schemas.microsoft.com/office/word/2016/wordml/cid" xmlns:w16="http://schemas.microsoft.com/office/word/2018/wordml" xmlns:w16du="http://schemas.microsoft.com/office/word/2023/wordml/word16du" xmlns:w16sdtdh="http://schemas.microsoft.com/office/word/2020/wordml/sdtdatahash" xmlns:w16sdtfl="http://schemas.microsoft.com/office/word/2024/wordml/sdtformatlock" xmlns:w16se="http://schemas.microsoft.com/office/word/2015/wordml/symex" xmlns:wpg="http://schemas.microsoft.com/office/word/2010/wordprocessingGroup" xmlns:wpi="http://schemas.microsoft.com/office/word/2010/wordprocessingInk" xmlns:wne="http://schemas.microsoft.com/office/word/2006/wordml" xmlns:wps="http://schemas.microsoft.com/office/word/2010/wordprocessingShape" mc:Ignorable="w14 w15 w16se w16cid w16 w16cex w16sdtdh w16sdtfl w16du wp14">
+<w:numbering xmlns:wpc="http://schemas.microsoft.com/office/word/2010/wordprocessingCanvas" xmlns:cx="http://schemas.microsoft.com/office/drawing/2014/chartex" xmlns:mc="http://schemas.openxmlformats.org/markup-compatibility/2006" xmlns:o="urn:schemas-microsoft-com:office:office" xmlns:r="http://schemas.openxmlformats.org/officeDocument/2006/relationships" xmlns:m="http://schemas.openxmlformats.org/officeDocument/2006/math" xmlns:v="urn:schemas-microsoft-com:vml" xmlns:wp14="http://schemas.microsoft.com/office/word/2010/wordprocessingDrawing" xmlns:wp="http://schemas.openxmlformats.org/drawingml/2006/wordprocessingDrawing" xmlns:w10="urn:schemas-microsoft-com:office:word" xmlns:w="http://schemas.openxmlformats.org/wordprocessingml/2006/main" xmlns:w14="http://schemas.microsoft.com/office/word/2010/wordml" xmlns:w15="http://schemas.microsoft.com/office/word/2012/wordml" xmlns:w16se="http://schemas.microsoft.com/office/word/2015/wordml/symex" xmlns:wpg="http://schemas.microsoft.com/office/word/2010/wordprocessingGroup" xmlns:wpi="http://schemas.microsoft.com/office/word/2010/wordprocessingInk" xmlns:wne="http://schemas.microsoft.com/office/word/2006/wordml" xmlns:wps="http://schemas.microsoft.com/office/word/2010/wordprocessingShape" mc:Ignorable="w14 w15 w16se wp14">
   <w:abstractNum w:abstractNumId="0" w15:restartNumberingAfterBreak="0">
     <w:nsid w:val="1043184F"/>
     <w:multiLevelType w:val="multilevel"/>
@@ -7796,32 +8970,32 @@
       </w:pPr>
     </w:lvl>
   </w:abstractNum>
-  <w:num w:numId="1" w16cid:durableId="1996953720">
+  <w:num w:numId="1">
     <w:abstractNumId w:val="4"/>
   </w:num>
-  <w:num w:numId="2" w16cid:durableId="1599558711">
+  <w:num w:numId="2">
     <w:abstractNumId w:val="5"/>
   </w:num>
-  <w:num w:numId="3" w16cid:durableId="575209542">
+  <w:num w:numId="3">
     <w:abstractNumId w:val="3"/>
   </w:num>
-  <w:num w:numId="4" w16cid:durableId="599067998">
+  <w:num w:numId="4">
     <w:abstractNumId w:val="1"/>
   </w:num>
-  <w:num w:numId="5" w16cid:durableId="115103925">
+  <w:num w:numId="5">
     <w:abstractNumId w:val="2"/>
   </w:num>
-  <w:num w:numId="6" w16cid:durableId="927228198">
+  <w:num w:numId="6">
     <w:abstractNumId w:val="6"/>
   </w:num>
-  <w:num w:numId="7" w16cid:durableId="2084719247">
+  <w:num w:numId="7">
     <w:abstractNumId w:val="0"/>
   </w:num>
 </w:numbering>
 </file>
 
 <file path=word/styles.xml><?xml version="1.0" encoding="utf-8"?>
-<w:styles xmlns:mc="http://schemas.openxmlformats.org/markup-compatibility/2006" xmlns:r="http://schemas.openxmlformats.org/officeDocument/2006/relationships" xmlns:w="http://schemas.openxmlformats.org/wordprocessingml/2006/main" xmlns:w14="http://schemas.microsoft.com/office/word/2010/wordml" xmlns:w15="http://schemas.microsoft.com/office/word/2012/wordml" xmlns:w16cex="http://schemas.microsoft.com/office/word/2018/wordml/cex" xmlns:w16cid="http://schemas.microsoft.com/office/word/2016/wordml/cid" xmlns:w16="http://schemas.microsoft.com/office/word/2018/wordml" xmlns:w16du="http://schemas.microsoft.com/office/word/2023/wordml/word16du" xmlns:w16sdtdh="http://schemas.microsoft.com/office/word/2020/wordml/sdtdatahash" xmlns:w16sdtfl="http://schemas.microsoft.com/office/word/2024/wordml/sdtformatlock" xmlns:w16se="http://schemas.microsoft.com/office/word/2015/wordml/symex" mc:Ignorable="w14 w15 w16se w16cid w16 w16cex w16sdtdh w16sdtfl w16du">
+<w:styles xmlns:mc="http://schemas.openxmlformats.org/markup-compatibility/2006" xmlns:r="http://schemas.openxmlformats.org/officeDocument/2006/relationships" xmlns:w="http://schemas.openxmlformats.org/wordprocessingml/2006/main" xmlns:w14="http://schemas.microsoft.com/office/word/2010/wordml" xmlns:w15="http://schemas.microsoft.com/office/word/2012/wordml" xmlns:w16se="http://schemas.microsoft.com/office/word/2015/wordml/symex" mc:Ignorable="w14 w15 w16se">
   <w:docDefaults>
     <w:rPrDefault>
       <w:rPr>
@@ -7839,7 +9013,7 @@
       </w:pPr>
     </w:pPrDefault>
   </w:docDefaults>
-  <w:latentStyles w:defLockedState="0" w:defUIPriority="99" w:defSemiHidden="0" w:defUnhideWhenUsed="0" w:defQFormat="0" w:count="376">
+  <w:latentStyles w:defLockedState="0" w:defUIPriority="99" w:defSemiHidden="0" w:defUnhideWhenUsed="0" w:defQFormat="0" w:count="371">
     <w:lsdException w:name="Normal" w:uiPriority="0" w:qFormat="1"/>
     <w:lsdException w:name="heading 1" w:uiPriority="9" w:qFormat="1"/>
     <w:lsdException w:name="heading 2" w:semiHidden="1" w:uiPriority="9" w:unhideWhenUsed="1" w:qFormat="1"/>
@@ -8211,11 +9385,6 @@
     <w:lsdException w:name="List Table 5 Dark Accent 6" w:uiPriority="50"/>
     <w:lsdException w:name="List Table 6 Colorful Accent 6" w:uiPriority="51"/>
     <w:lsdException w:name="List Table 7 Colorful Accent 6" w:uiPriority="52"/>
-    <w:lsdException w:name="Mention" w:semiHidden="1" w:unhideWhenUsed="1"/>
-    <w:lsdException w:name="Smart Hyperlink" w:semiHidden="1" w:unhideWhenUsed="1"/>
-    <w:lsdException w:name="Hashtag" w:semiHidden="1" w:unhideWhenUsed="1"/>
-    <w:lsdException w:name="Unresolved Mention" w:semiHidden="1" w:unhideWhenUsed="1"/>
-    <w:lsdException w:name="Smart Link" w:semiHidden="1" w:unhideWhenUsed="1"/>
   </w:latentStyles>
   <w:style w:type="paragraph" w:default="1" w:styleId="Normal">
     <w:name w:val="Normal"/>
@@ -8250,7 +9419,7 @@
     <w:uiPriority w:val="9"/>
     <w:unhideWhenUsed/>
     <w:qFormat/>
-    <w:rsid w:val="00064A73"/>
+    <w:rsid w:val="008A4CBC"/>
     <w:pPr>
       <w:keepNext/>
       <w:keepLines/>
@@ -8422,6 +9591,7 @@
   <w:style w:type="character" w:default="1" w:styleId="Fuentedeprrafopredeter">
     <w:name w:val="Default Paragraph Font"/>
     <w:uiPriority w:val="1"/>
+    <w:semiHidden/>
     <w:unhideWhenUsed/>
   </w:style>
   <w:style w:type="table" w:default="1" w:styleId="Tablanormal">
@@ -8463,7 +9633,7 @@
     <w:basedOn w:val="Fuentedeprrafopredeter"/>
     <w:link w:val="Ttulo2"/>
     <w:uiPriority w:val="9"/>
-    <w:rsid w:val="00064A73"/>
+    <w:rsid w:val="008A4CBC"/>
     <w:rPr>
       <w:rFonts w:asciiTheme="majorHAnsi" w:eastAsiaTheme="majorEastAsia" w:hAnsiTheme="majorHAnsi" w:cstheme="majorBidi"/>
       <w:color w:val="0F4761" w:themeColor="accent1" w:themeShade="BF"/>
@@ -8764,6 +9934,62 @@
       <w:kern w:val="0"/>
       <w:lang w:eastAsia="es-AR"/>
       <w14:ligatures w14:val="none"/>
+    </w:rPr>
+  </w:style>
+  <w:style w:type="paragraph" w:styleId="TtuloTDC">
+    <w:name w:val="TOC Heading"/>
+    <w:basedOn w:val="Ttulo1"/>
+    <w:next w:val="Normal"/>
+    <w:uiPriority w:val="39"/>
+    <w:unhideWhenUsed/>
+    <w:qFormat/>
+    <w:rsid w:val="001D18F8"/>
+    <w:pPr>
+      <w:spacing w:before="240" w:after="0" w:line="259" w:lineRule="auto"/>
+      <w:outlineLvl w:val="9"/>
+    </w:pPr>
+    <w:rPr>
+      <w:kern w:val="0"/>
+      <w:sz w:val="32"/>
+      <w:szCs w:val="32"/>
+      <w:lang w:eastAsia="es-AR"/>
+      <w14:ligatures w14:val="none"/>
+    </w:rPr>
+  </w:style>
+  <w:style w:type="paragraph" w:styleId="TDC1">
+    <w:name w:val="toc 1"/>
+    <w:basedOn w:val="Normal"/>
+    <w:next w:val="Normal"/>
+    <w:autoRedefine/>
+    <w:uiPriority w:val="39"/>
+    <w:unhideWhenUsed/>
+    <w:rsid w:val="001D18F8"/>
+    <w:pPr>
+      <w:spacing w:after="100"/>
+    </w:pPr>
+  </w:style>
+  <w:style w:type="paragraph" w:styleId="TDC2">
+    <w:name w:val="toc 2"/>
+    <w:basedOn w:val="Normal"/>
+    <w:next w:val="Normal"/>
+    <w:autoRedefine/>
+    <w:uiPriority w:val="39"/>
+    <w:unhideWhenUsed/>
+    <w:rsid w:val="001D18F8"/>
+    <w:pPr>
+      <w:spacing w:after="100"/>
+      <w:ind w:left="240"/>
+    </w:pPr>
+  </w:style>
+  <w:style w:type="character" w:styleId="Hipervnculo">
+    <w:name w:val="Hyperlink"/>
+    <w:basedOn w:val="Fuentedeprrafopredeter"/>
+    <w:uiPriority w:val="99"/>
+    <w:unhideWhenUsed/>
+    <w:rsid w:val="001D18F8"/>
+    <w:rPr>
+      <w:color w:val="467886" w:themeColor="hyperlink"/>
+      <w:u w:val="single"/>
     </w:rPr>
   </w:style>
 </w:styles>
@@ -9082,4 +10308,16 @@
     </a:ext>
   </a:extLst>
 </a:theme>
+</file>
+
+<file path=customXml/item1.xml><?xml version="1.0" encoding="utf-8"?>
+<b:Sources xmlns:b="http://schemas.openxmlformats.org/officeDocument/2006/bibliography" xmlns="http://schemas.openxmlformats.org/officeDocument/2006/bibliography" SelectedStyle="\APASixthEditionOfficeOnline.xsl" StyleName="APA" Version="6"/>
+</file>
+
+<file path=customXml/itemProps1.xml><?xml version="1.0" encoding="utf-8"?>
+<ds:datastoreItem xmlns:ds="http://schemas.openxmlformats.org/officeDocument/2006/customXml" ds:itemID="{140DECEC-0D6C-4ED6-B6C8-6B7605DBA997}">
+  <ds:schemaRefs>
+    <ds:schemaRef ds:uri="http://schemas.openxmlformats.org/officeDocument/2006/bibliography"/>
+  </ds:schemaRefs>
+</ds:datastoreItem>
 </file>
</xml_diff>